<commit_message>
mise a jours nico etl
</commit_message>
<xml_diff>
--- a/suivis/méthodologie_gaudin_maurin.docx
+++ b/suivis/méthodologie_gaudin_maurin.docx
@@ -450,9 +450,14 @@
       <w:r>
         <w:t xml:space="preserve"> a été conçu afin de répondre aux besoins d’analyse de l’agence </w:t>
       </w:r>
+      <w:proofErr w:type="gramStart"/>
       <w:r>
         <w:lastRenderedPageBreak/>
-        <w:t xml:space="preserve">immobilière. L’architecture retenue repose sur un </w:t>
+        <w:t>immobilière</w:t>
+      </w:r>
+      <w:proofErr w:type="gramEnd"/>
+      <w:r>
+        <w:t xml:space="preserve">. L’architecture retenue repose sur un </w:t>
       </w:r>
       <w:r>
         <w:rPr>
@@ -4304,6 +4309,64 @@
         <w:jc w:val="both"/>
       </w:pPr>
       <w:r>
+        <w:rPr>
+          <w:noProof/>
+        </w:rPr>
+        <w:drawing>
+          <wp:inline distT="0" distB="0" distL="0" distR="0" wp14:anchorId="63BE1E72" wp14:editId="326B9502">
+            <wp:extent cx="2833370" cy="2032000"/>
+            <wp:effectExtent l="0" t="0" r="5080" b="6350"/>
+            <wp:docPr id="555953164" name="Image 1"/>
+            <wp:cNvGraphicFramePr>
+              <a:graphicFrameLocks xmlns:a="http://schemas.openxmlformats.org/drawingml/2006/main" noChangeAspect="1"/>
+            </wp:cNvGraphicFramePr>
+            <a:graphic xmlns:a="http://schemas.openxmlformats.org/drawingml/2006/main">
+              <a:graphicData uri="http://schemas.openxmlformats.org/drawingml/2006/picture">
+                <pic:pic xmlns:pic="http://schemas.openxmlformats.org/drawingml/2006/picture">
+                  <pic:nvPicPr>
+                    <pic:cNvPr id="0" name="Picture 15"/>
+                    <pic:cNvPicPr>
+                      <a:picLocks noChangeAspect="1" noChangeArrowheads="1"/>
+                    </pic:cNvPicPr>
+                  </pic:nvPicPr>
+                  <pic:blipFill>
+                    <a:blip r:embed="rId9">
+                      <a:extLst>
+                        <a:ext uri="{28A0092B-C50C-407E-A947-70E740481C1C}">
+                          <a14:useLocalDpi xmlns:a14="http://schemas.microsoft.com/office/drawing/2010/main" val="0"/>
+                        </a:ext>
+                      </a:extLst>
+                    </a:blip>
+                    <a:srcRect/>
+                    <a:stretch>
+                      <a:fillRect/>
+                    </a:stretch>
+                  </pic:blipFill>
+                  <pic:spPr bwMode="auto">
+                    <a:xfrm>
+                      <a:off x="0" y="0"/>
+                      <a:ext cx="2833370" cy="2032000"/>
+                    </a:xfrm>
+                    <a:prstGeom prst="rect">
+                      <a:avLst/>
+                    </a:prstGeom>
+                    <a:noFill/>
+                    <a:ln>
+                      <a:noFill/>
+                    </a:ln>
+                  </pic:spPr>
+                </pic:pic>
+              </a:graphicData>
+            </a:graphic>
+          </wp:inline>
+        </w:drawing>
+      </w:r>
+    </w:p>
+    <w:p>
+      <w:pPr>
+        <w:jc w:val="both"/>
+      </w:pPr>
+      <w:r>
         <w:t xml:space="preserve">La dimension </w:t>
       </w:r>
       <w:r>
@@ -4434,6 +4497,7 @@
         <w:jc w:val="both"/>
       </w:pPr>
       <w:r>
+        <w:lastRenderedPageBreak/>
         <w:t xml:space="preserve">Ces indicateurs sont stockés sous forme booléenne (0/1) dans l’entrepôt, ce qui permet d’optimiser les filtres et agrégations dans Power BI et d’éviter des règles métier complexes côté </w:t>
       </w:r>
       <w:proofErr w:type="spellStart"/>
@@ -4536,11 +4600,7 @@
         <w:t>ID_LOT</w:t>
       </w:r>
       <w:r>
-        <w:t xml:space="preserve">, qui référence l’identifiant d’un autre bien. Lors du chargement initial de la dimension D_BIEN, cet </w:t>
-      </w:r>
-      <w:r>
-        <w:lastRenderedPageBreak/>
-        <w:t xml:space="preserve">identifiant est conservé sous la forme </w:t>
+        <w:t xml:space="preserve">, qui référence l’identifiant d’un autre bien. Lors du chargement initial de la dimension D_BIEN, cet identifiant est conservé sous la forme </w:t>
       </w:r>
       <w:r>
         <w:rPr>
@@ -5017,6 +5077,7 @@
             </w:pPr>
             <w:proofErr w:type="gramStart"/>
             <w:r>
+              <w:lastRenderedPageBreak/>
               <w:t>surface</w:t>
             </w:r>
             <w:proofErr w:type="gramEnd"/>
@@ -5448,7 +5509,6 @@
             <w:proofErr w:type="spellStart"/>
             <w:proofErr w:type="gramStart"/>
             <w:r>
-              <w:lastRenderedPageBreak/>
               <w:t>id</w:t>
             </w:r>
             <w:proofErr w:type="gramEnd"/>
@@ -5628,6 +5688,72 @@
     </w:p>
     <w:p>
       <w:pPr>
+        <w:jc w:val="center"/>
+        <w:rPr>
+          <w:b/>
+          <w:bCs/>
+          <w:u w:val="single"/>
+        </w:rPr>
+      </w:pPr>
+      <w:r>
+        <w:rPr>
+          <w:b/>
+          <w:bCs/>
+          <w:noProof/>
+          <w:u w:val="single"/>
+        </w:rPr>
+        <w:drawing>
+          <wp:inline distT="0" distB="0" distL="0" distR="0" wp14:anchorId="4696D754" wp14:editId="7A495E7A">
+            <wp:extent cx="5757545" cy="3477260"/>
+            <wp:effectExtent l="0" t="0" r="0" b="8890"/>
+            <wp:docPr id="1532945206" name="Image 2"/>
+            <wp:cNvGraphicFramePr>
+              <a:graphicFrameLocks xmlns:a="http://schemas.openxmlformats.org/drawingml/2006/main" noChangeAspect="1"/>
+            </wp:cNvGraphicFramePr>
+            <a:graphic xmlns:a="http://schemas.openxmlformats.org/drawingml/2006/main">
+              <a:graphicData uri="http://schemas.openxmlformats.org/drawingml/2006/picture">
+                <pic:pic xmlns:pic="http://schemas.openxmlformats.org/drawingml/2006/picture">
+                  <pic:nvPicPr>
+                    <pic:cNvPr id="0" name="Picture 16"/>
+                    <pic:cNvPicPr>
+                      <a:picLocks noChangeAspect="1" noChangeArrowheads="1"/>
+                    </pic:cNvPicPr>
+                  </pic:nvPicPr>
+                  <pic:blipFill>
+                    <a:blip r:embed="rId10">
+                      <a:extLst>
+                        <a:ext uri="{28A0092B-C50C-407E-A947-70E740481C1C}">
+                          <a14:useLocalDpi xmlns:a14="http://schemas.microsoft.com/office/drawing/2010/main" val="0"/>
+                        </a:ext>
+                      </a:extLst>
+                    </a:blip>
+                    <a:srcRect/>
+                    <a:stretch>
+                      <a:fillRect/>
+                    </a:stretch>
+                  </pic:blipFill>
+                  <pic:spPr bwMode="auto">
+                    <a:xfrm>
+                      <a:off x="0" y="0"/>
+                      <a:ext cx="5757545" cy="3477260"/>
+                    </a:xfrm>
+                    <a:prstGeom prst="rect">
+                      <a:avLst/>
+                    </a:prstGeom>
+                    <a:noFill/>
+                    <a:ln>
+                      <a:noFill/>
+                    </a:ln>
+                  </pic:spPr>
+                </pic:pic>
+              </a:graphicData>
+            </a:graphic>
+          </wp:inline>
+        </w:drawing>
+      </w:r>
+    </w:p>
+    <w:p>
+      <w:pPr>
         <w:jc w:val="both"/>
       </w:pPr>
       <w:r>
@@ -5641,7 +5767,11 @@
         <w:t>P_D_BIEN_LOT</w:t>
       </w:r>
       <w:r>
-        <w:t xml:space="preserve"> a pour objectif de gérer le rattachement hiérarchique des biens immobiliers appartenant à un même lot. Dans le système source Oracle, cette relation est modélisée par l’attribut </w:t>
+        <w:t xml:space="preserve"> a pour objectif de gérer le rattachement hiérarchique des biens immobiliers appartenant à un même lot. Dans le système source Oracle, cette </w:t>
+      </w:r>
+      <w:r>
+        <w:lastRenderedPageBreak/>
+        <w:t xml:space="preserve">relation est modélisée par l’attribut </w:t>
       </w:r>
       <w:r>
         <w:rPr>
@@ -5942,7 +6072,6 @@
         <w:jc w:val="both"/>
       </w:pPr>
       <w:r>
-        <w:lastRenderedPageBreak/>
         <w:t xml:space="preserve">Lorsque qu’un bien enfant identifié comme </w:t>
       </w:r>
       <w:r>
@@ -6108,6 +6237,7 @@
             <w:proofErr w:type="spellStart"/>
             <w:proofErr w:type="gramStart"/>
             <w:r>
+              <w:lastRenderedPageBreak/>
               <w:t>sk</w:t>
             </w:r>
             <w:proofErr w:type="gramEnd"/>
@@ -6308,6 +6438,64 @@
         <w:jc w:val="both"/>
       </w:pPr>
       <w:r>
+        <w:rPr>
+          <w:noProof/>
+        </w:rPr>
+        <w:drawing>
+          <wp:inline distT="0" distB="0" distL="0" distR="0" wp14:anchorId="33F0316B" wp14:editId="14EE443E">
+            <wp:extent cx="3341370" cy="756285"/>
+            <wp:effectExtent l="0" t="0" r="0" b="5715"/>
+            <wp:docPr id="241259112" name="Image 3"/>
+            <wp:cNvGraphicFramePr>
+              <a:graphicFrameLocks xmlns:a="http://schemas.openxmlformats.org/drawingml/2006/main" noChangeAspect="1"/>
+            </wp:cNvGraphicFramePr>
+            <a:graphic xmlns:a="http://schemas.openxmlformats.org/drawingml/2006/main">
+              <a:graphicData uri="http://schemas.openxmlformats.org/drawingml/2006/picture">
+                <pic:pic xmlns:pic="http://schemas.openxmlformats.org/drawingml/2006/picture">
+                  <pic:nvPicPr>
+                    <pic:cNvPr id="0" name="Picture 17"/>
+                    <pic:cNvPicPr>
+                      <a:picLocks noChangeAspect="1" noChangeArrowheads="1"/>
+                    </pic:cNvPicPr>
+                  </pic:nvPicPr>
+                  <pic:blipFill>
+                    <a:blip r:embed="rId11">
+                      <a:extLst>
+                        <a:ext uri="{28A0092B-C50C-407E-A947-70E740481C1C}">
+                          <a14:useLocalDpi xmlns:a14="http://schemas.microsoft.com/office/drawing/2010/main" val="0"/>
+                        </a:ext>
+                      </a:extLst>
+                    </a:blip>
+                    <a:srcRect/>
+                    <a:stretch>
+                      <a:fillRect/>
+                    </a:stretch>
+                  </pic:blipFill>
+                  <pic:spPr bwMode="auto">
+                    <a:xfrm>
+                      <a:off x="0" y="0"/>
+                      <a:ext cx="3341370" cy="756285"/>
+                    </a:xfrm>
+                    <a:prstGeom prst="rect">
+                      <a:avLst/>
+                    </a:prstGeom>
+                    <a:noFill/>
+                    <a:ln>
+                      <a:noFill/>
+                    </a:ln>
+                  </pic:spPr>
+                </pic:pic>
+              </a:graphicData>
+            </a:graphic>
+          </wp:inline>
+        </w:drawing>
+      </w:r>
+    </w:p>
+    <w:p>
+      <w:pPr>
+        <w:jc w:val="both"/>
+      </w:pPr>
+      <w:r>
         <w:t xml:space="preserve">La dimension </w:t>
       </w:r>
       <w:r>
@@ -6336,7 +6524,6 @@
         <w:jc w:val="both"/>
       </w:pPr>
       <w:r>
-        <w:lastRenderedPageBreak/>
         <w:t xml:space="preserve">Le pipeline commence par une extraction des identifiants et informations nominatives des agents (identifiant métier, nom, prénom) à l’aide d’une étape </w:t>
       </w:r>
       <w:r>
@@ -6420,6 +6607,7 @@
       </w:pPr>
       <w:proofErr w:type="gramStart"/>
       <w:r>
+        <w:lastRenderedPageBreak/>
         <w:t>si</w:t>
       </w:r>
       <w:proofErr w:type="gramEnd"/>
@@ -6806,6 +6994,69 @@
     </w:p>
     <w:p>
       <w:pPr>
+        <w:rPr>
+          <w:b/>
+          <w:bCs/>
+        </w:rPr>
+      </w:pPr>
+      <w:r>
+        <w:rPr>
+          <w:b/>
+          <w:bCs/>
+          <w:noProof/>
+        </w:rPr>
+        <w:drawing>
+          <wp:inline distT="0" distB="0" distL="0" distR="0" wp14:anchorId="11B934AB" wp14:editId="3436FEDD">
+            <wp:extent cx="3937635" cy="3321685"/>
+            <wp:effectExtent l="0" t="0" r="5715" b="0"/>
+            <wp:docPr id="1248965760" name="Image 4"/>
+            <wp:cNvGraphicFramePr>
+              <a:graphicFrameLocks xmlns:a="http://schemas.openxmlformats.org/drawingml/2006/main" noChangeAspect="1"/>
+            </wp:cNvGraphicFramePr>
+            <a:graphic xmlns:a="http://schemas.openxmlformats.org/drawingml/2006/main">
+              <a:graphicData uri="http://schemas.openxmlformats.org/drawingml/2006/picture">
+                <pic:pic xmlns:pic="http://schemas.openxmlformats.org/drawingml/2006/picture">
+                  <pic:nvPicPr>
+                    <pic:cNvPr id="0" name="Picture 18"/>
+                    <pic:cNvPicPr>
+                      <a:picLocks noChangeAspect="1" noChangeArrowheads="1"/>
+                    </pic:cNvPicPr>
+                  </pic:nvPicPr>
+                  <pic:blipFill>
+                    <a:blip r:embed="rId12">
+                      <a:extLst>
+                        <a:ext uri="{28A0092B-C50C-407E-A947-70E740481C1C}">
+                          <a14:useLocalDpi xmlns:a14="http://schemas.microsoft.com/office/drawing/2010/main" val="0"/>
+                        </a:ext>
+                      </a:extLst>
+                    </a:blip>
+                    <a:srcRect/>
+                    <a:stretch>
+                      <a:fillRect/>
+                    </a:stretch>
+                  </pic:blipFill>
+                  <pic:spPr bwMode="auto">
+                    <a:xfrm>
+                      <a:off x="0" y="0"/>
+                      <a:ext cx="3937635" cy="3321685"/>
+                    </a:xfrm>
+                    <a:prstGeom prst="rect">
+                      <a:avLst/>
+                    </a:prstGeom>
+                    <a:noFill/>
+                    <a:ln>
+                      <a:noFill/>
+                    </a:ln>
+                  </pic:spPr>
+                </pic:pic>
+              </a:graphicData>
+            </a:graphic>
+          </wp:inline>
+        </w:drawing>
+      </w:r>
+    </w:p>
+    <w:p>
+      <w:pPr>
         <w:jc w:val="both"/>
       </w:pPr>
       <w:r>
@@ -6837,6 +7088,7 @@
         <w:jc w:val="both"/>
       </w:pPr>
       <w:r>
+        <w:lastRenderedPageBreak/>
         <w:t xml:space="preserve">Le pipeline extrait les données depuis la table opérationnelle </w:t>
       </w:r>
       <w:r>
@@ -6893,7 +7145,6 @@
         <w:jc w:val="both"/>
       </w:pPr>
       <w:r>
-        <w:lastRenderedPageBreak/>
         <w:t xml:space="preserve">Les dates </w:t>
       </w:r>
       <w:r>
@@ -7275,6 +7526,7 @@
           <w:b/>
           <w:bCs/>
         </w:rPr>
+        <w:lastRenderedPageBreak/>
         <w:t>DELAI_VISITE_ACHAT_JOURS</w:t>
       </w:r>
       <w:r>
@@ -7305,7 +7557,6 @@
         <w:jc w:val="both"/>
       </w:pPr>
       <w:r>
-        <w:lastRenderedPageBreak/>
         <w:t>Ces indicateurs sont calculés dans le pipeline afin de déporter la logique métier hors des outils de restitution et d’optimiser les performances des analyses dans Power BI.</w:t>
       </w:r>
     </w:p>
@@ -8038,6 +8289,7 @@
             <w:proofErr w:type="spellStart"/>
             <w:proofErr w:type="gramStart"/>
             <w:r>
+              <w:lastRenderedPageBreak/>
               <w:t>ecart</w:t>
             </w:r>
             <w:proofErr w:type="gramEnd"/>
@@ -8140,169 +8392,237 @@
     </w:p>
     <w:p>
       <w:pPr>
-        <w:jc w:val="both"/>
-        <w:rPr>
-          <w:b/>
-          <w:bCs/>
-        </w:rPr>
-      </w:pPr>
-      <w:r>
-        <w:rPr>
-          <w:b/>
-          <w:bCs/>
-        </w:rPr>
+        <w:ind w:firstLine="708"/>
+        <w:jc w:val="both"/>
+        <w:rPr>
+          <w:b/>
+          <w:bCs/>
+        </w:rPr>
+      </w:pPr>
+      <w:r>
+        <w:rPr>
+          <w:b/>
+          <w:bCs/>
+        </w:rPr>
+        <w:t>Pipeline P_F_LOCATION – Alimentation de la table de faits Location</w:t>
+      </w:r>
+    </w:p>
+    <w:p>
+      <w:pPr>
+        <w:ind w:firstLine="708"/>
+        <w:rPr>
+          <w:b/>
+          <w:bCs/>
+        </w:rPr>
+      </w:pPr>
+      <w:r>
+        <w:rPr>
+          <w:b/>
+          <w:bCs/>
+          <w:noProof/>
+        </w:rPr>
+        <w:drawing>
+          <wp:inline distT="0" distB="0" distL="0" distR="0" wp14:anchorId="6F632EA6" wp14:editId="0D14F264">
+            <wp:extent cx="2969260" cy="3274060"/>
+            <wp:effectExtent l="0" t="0" r="2540" b="2540"/>
+            <wp:docPr id="69082398" name="Image 5"/>
+            <wp:cNvGraphicFramePr>
+              <a:graphicFrameLocks xmlns:a="http://schemas.openxmlformats.org/drawingml/2006/main" noChangeAspect="1"/>
+            </wp:cNvGraphicFramePr>
+            <a:graphic xmlns:a="http://schemas.openxmlformats.org/drawingml/2006/main">
+              <a:graphicData uri="http://schemas.openxmlformats.org/drawingml/2006/picture">
+                <pic:pic xmlns:pic="http://schemas.openxmlformats.org/drawingml/2006/picture">
+                  <pic:nvPicPr>
+                    <pic:cNvPr id="0" name="Picture 19"/>
+                    <pic:cNvPicPr>
+                      <a:picLocks noChangeAspect="1" noChangeArrowheads="1"/>
+                    </pic:cNvPicPr>
+                  </pic:nvPicPr>
+                  <pic:blipFill>
+                    <a:blip r:embed="rId13">
+                      <a:extLst>
+                        <a:ext uri="{28A0092B-C50C-407E-A947-70E740481C1C}">
+                          <a14:useLocalDpi xmlns:a14="http://schemas.microsoft.com/office/drawing/2010/main" val="0"/>
+                        </a:ext>
+                      </a:extLst>
+                    </a:blip>
+                    <a:srcRect/>
+                    <a:stretch>
+                      <a:fillRect/>
+                    </a:stretch>
+                  </pic:blipFill>
+                  <pic:spPr bwMode="auto">
+                    <a:xfrm>
+                      <a:off x="0" y="0"/>
+                      <a:ext cx="2969260" cy="3274060"/>
+                    </a:xfrm>
+                    <a:prstGeom prst="rect">
+                      <a:avLst/>
+                    </a:prstGeom>
+                    <a:noFill/>
+                    <a:ln>
+                      <a:noFill/>
+                    </a:ln>
+                  </pic:spPr>
+                </pic:pic>
+              </a:graphicData>
+            </a:graphic>
+          </wp:inline>
+        </w:drawing>
+      </w:r>
+    </w:p>
+    <w:p>
+      <w:pPr>
+        <w:jc w:val="both"/>
+      </w:pPr>
+      <w:r>
+        <w:t xml:space="preserve">Le pipeline </w:t>
+      </w:r>
+      <w:r>
+        <w:rPr>
+          <w:b/>
+          <w:bCs/>
+        </w:rPr>
+        <w:t>P_F_LOCATION</w:t>
+      </w:r>
+      <w:r>
+        <w:t xml:space="preserve"> a pour objectif d’alimenter la table de faits </w:t>
+      </w:r>
+      <w:r>
+        <w:rPr>
+          <w:b/>
+          <w:bCs/>
+        </w:rPr>
+        <w:t>F_LOCATION</w:t>
+      </w:r>
+      <w:r>
+        <w:t>, qui enregistre les événements de location immobilière réalisés par l’agence. Cette table de faits constitue un second axe majeur de l’analyse décisionnelle et permet d’étudier l’activité locative selon les dimensions temporelles, clients, agents, biens et localisation, ainsi que selon des indicateurs temporels et financiers spécifiques à la location.</w:t>
+      </w:r>
+    </w:p>
+    <w:p>
+      <w:pPr>
+        <w:jc w:val="both"/>
+      </w:pPr>
+      <w:r>
+        <w:t xml:space="preserve">Le pipeline extrait les données depuis la table opérationnelle </w:t>
+      </w:r>
+      <w:r>
+        <w:rPr>
+          <w:b/>
+          <w:bCs/>
+        </w:rPr>
+        <w:t>LOCATION</w:t>
+      </w:r>
+      <w:r>
+        <w:t xml:space="preserve"> de la base Oracle. Chaque enregistrement correspond à un événement de location identifié par la combinaison des identifiants métier </w:t>
+      </w:r>
+      <w:r>
+        <w:rPr>
+          <w:b/>
+          <w:bCs/>
+        </w:rPr>
+        <w:t>ID_BIEN</w:t>
+      </w:r>
+      <w:r>
+        <w:t xml:space="preserve">, </w:t>
+      </w:r>
+      <w:r>
+        <w:rPr>
+          <w:b/>
+          <w:bCs/>
+        </w:rPr>
+        <w:t>ID_CLIENT</w:t>
+      </w:r>
+      <w:r>
+        <w:t xml:space="preserve"> et </w:t>
+      </w:r>
+      <w:r>
+        <w:rPr>
+          <w:b/>
+          <w:bCs/>
+        </w:rPr>
+        <w:t>ID_AGENT</w:t>
+      </w:r>
+      <w:r>
+        <w:t xml:space="preserve">, ainsi que par les dates associées à la visite et à la location effective. Ces identifiants métiers sont conservés temporairement dans le flux afin d’être traduits en clés techniques lors des étapes de </w:t>
+      </w:r>
+      <w:proofErr w:type="spellStart"/>
+      <w:r>
+        <w:t>lookup</w:t>
+      </w:r>
+      <w:proofErr w:type="spellEnd"/>
+      <w:r>
+        <w:t xml:space="preserve"> vers les dimensions de l’entrepôt.</w:t>
+      </w:r>
+    </w:p>
+    <w:p>
+      <w:pPr>
+        <w:jc w:val="both"/>
+      </w:pPr>
+      <w:r>
+        <w:t xml:space="preserve">Les dates </w:t>
+      </w:r>
+      <w:r>
+        <w:rPr>
+          <w:b/>
+          <w:bCs/>
+        </w:rPr>
+        <w:t>DATE_VISITE_LOC</w:t>
+      </w:r>
+      <w:r>
+        <w:t xml:space="preserve"> et </w:t>
+      </w:r>
+      <w:r>
+        <w:rPr>
+          <w:b/>
+          <w:bCs/>
+        </w:rPr>
+        <w:t>DATE_LOC</w:t>
+      </w:r>
+      <w:r>
+        <w:t xml:space="preserve"> sont préalablement normalisées dans l’ETL afin d’en extraire des dates calendaires sans composante horaire. Ces dates sont ensuite utilisées pour effectuer des </w:t>
+      </w:r>
+      <w:proofErr w:type="spellStart"/>
+      <w:r>
+        <w:t>lookups</w:t>
+      </w:r>
+      <w:proofErr w:type="spellEnd"/>
+      <w:r>
+        <w:t xml:space="preserve"> vers la dimension </w:t>
+      </w:r>
+      <w:r>
+        <w:rPr>
+          <w:b/>
+          <w:bCs/>
+        </w:rPr>
+        <w:t>D_DATE</w:t>
+      </w:r>
+      <w:r>
+        <w:t xml:space="preserve">, permettant de récupérer les clés techniques </w:t>
+      </w:r>
+      <w:r>
+        <w:rPr>
+          <w:b/>
+          <w:bCs/>
+        </w:rPr>
+        <w:t>SK_DATE_VISITE</w:t>
+      </w:r>
+      <w:r>
+        <w:t xml:space="preserve"> et </w:t>
+      </w:r>
+      <w:r>
+        <w:rPr>
+          <w:b/>
+          <w:bCs/>
+        </w:rPr>
+        <w:t>SK_DATE_LOCATION</w:t>
+      </w:r>
+      <w:r>
+        <w:t xml:space="preserve">. Cette étape garantit une </w:t>
+      </w:r>
+      <w:r>
         <w:lastRenderedPageBreak/>
-        <w:t>Pipeline P_F_LOCATION – Alimentation de la table de faits Location</w:t>
-      </w:r>
-    </w:p>
-    <w:p>
-      <w:pPr>
-        <w:jc w:val="both"/>
-      </w:pPr>
-      <w:r>
-        <w:t xml:space="preserve">Le pipeline </w:t>
-      </w:r>
-      <w:r>
-        <w:rPr>
-          <w:b/>
-          <w:bCs/>
-        </w:rPr>
-        <w:t>P_F_LOCATION</w:t>
-      </w:r>
-      <w:r>
-        <w:t xml:space="preserve"> a pour objectif d’alimenter la table de faits </w:t>
-      </w:r>
-      <w:r>
-        <w:rPr>
-          <w:b/>
-          <w:bCs/>
-        </w:rPr>
-        <w:t>F_LOCATION</w:t>
-      </w:r>
-      <w:r>
-        <w:t>, qui enregistre les événements de location immobilière réalisés par l’agence. Cette table de faits constitue un second axe majeur de l’analyse décisionnelle et permet d’étudier l’activité locative selon les dimensions temporelles, clients, agents, biens et localisation, ainsi que selon des indicateurs temporels et financiers spécifiques à la location.</w:t>
-      </w:r>
-    </w:p>
-    <w:p>
-      <w:pPr>
-        <w:jc w:val="both"/>
-      </w:pPr>
-      <w:r>
-        <w:t xml:space="preserve">Le pipeline extrait les données depuis la table opérationnelle </w:t>
-      </w:r>
-      <w:r>
-        <w:rPr>
-          <w:b/>
-          <w:bCs/>
-        </w:rPr>
-        <w:t>LOCATION</w:t>
-      </w:r>
-      <w:r>
-        <w:t xml:space="preserve"> de la base Oracle. Chaque enregistrement correspond à un événement de location identifié par la combinaison des identifiants métier </w:t>
-      </w:r>
-      <w:r>
-        <w:rPr>
-          <w:b/>
-          <w:bCs/>
-        </w:rPr>
-        <w:t>ID_BIEN</w:t>
-      </w:r>
-      <w:r>
-        <w:t xml:space="preserve">, </w:t>
-      </w:r>
-      <w:r>
-        <w:rPr>
-          <w:b/>
-          <w:bCs/>
-        </w:rPr>
-        <w:t>ID_CLIENT</w:t>
-      </w:r>
-      <w:r>
-        <w:t xml:space="preserve"> et </w:t>
-      </w:r>
-      <w:r>
-        <w:rPr>
-          <w:b/>
-          <w:bCs/>
-        </w:rPr>
-        <w:t>ID_AGENT</w:t>
-      </w:r>
-      <w:r>
-        <w:t xml:space="preserve">, ainsi que par les dates associées à la visite et à la location effective. Ces identifiants métiers sont conservés temporairement dans le flux afin d’être traduits en clés techniques lors des étapes de </w:t>
-      </w:r>
-      <w:proofErr w:type="spellStart"/>
-      <w:r>
-        <w:t>lookup</w:t>
-      </w:r>
-      <w:proofErr w:type="spellEnd"/>
-      <w:r>
-        <w:t xml:space="preserve"> vers les dimensions de l’entrepôt.</w:t>
-      </w:r>
-    </w:p>
-    <w:p>
-      <w:pPr>
-        <w:jc w:val="both"/>
-      </w:pPr>
-      <w:r>
-        <w:t xml:space="preserve">Les dates </w:t>
-      </w:r>
-      <w:r>
-        <w:rPr>
-          <w:b/>
-          <w:bCs/>
-        </w:rPr>
-        <w:t>DATE_VISITE_LOC</w:t>
-      </w:r>
-      <w:r>
-        <w:t xml:space="preserve"> et </w:t>
-      </w:r>
-      <w:r>
-        <w:rPr>
-          <w:b/>
-          <w:bCs/>
-        </w:rPr>
-        <w:t>DATE_LOC</w:t>
-      </w:r>
-      <w:r>
-        <w:t xml:space="preserve"> sont préalablement normalisées dans l’ETL afin d’en extraire des dates calendaires sans composante horaire. Ces dates sont ensuite utilisées pour effectuer des </w:t>
-      </w:r>
-      <w:proofErr w:type="spellStart"/>
-      <w:r>
-        <w:t>lookups</w:t>
-      </w:r>
-      <w:proofErr w:type="spellEnd"/>
-      <w:r>
-        <w:t xml:space="preserve"> vers la dimension </w:t>
-      </w:r>
-      <w:r>
-        <w:rPr>
-          <w:b/>
-          <w:bCs/>
-        </w:rPr>
-        <w:t>D_DATE</w:t>
-      </w:r>
-      <w:r>
-        <w:t xml:space="preserve">, permettant de récupérer les clés techniques </w:t>
-      </w:r>
-      <w:r>
-        <w:rPr>
-          <w:b/>
-          <w:bCs/>
-        </w:rPr>
-        <w:t>SK_DATE_VISITE</w:t>
-      </w:r>
-      <w:r>
-        <w:t xml:space="preserve"> et </w:t>
-      </w:r>
-      <w:r>
-        <w:rPr>
-          <w:b/>
-          <w:bCs/>
-        </w:rPr>
-        <w:t>SK_DATE_LOCATION</w:t>
-      </w:r>
-      <w:r>
-        <w:t>. Cette étape garantit une cohérence temporelle complète entre la table de faits et la dimension temps, et assure l’alignement des analyses entre achats et locations.</w:t>
+        <w:t>cohérence temporelle complète entre la table de faits et la dimension temps, et assure l’alignement des analyses entre achats et locations.</w:t>
       </w:r>
     </w:p>
     <w:p>
@@ -8606,7 +8926,6 @@
           <w:b/>
           <w:bCs/>
         </w:rPr>
-        <w:lastRenderedPageBreak/>
         <w:t>DELAI_VISITE_LOCATION_JOURS</w:t>
       </w:r>
       <w:r>
@@ -8748,6 +9067,7 @@
                 <w:b/>
                 <w:bCs/>
               </w:rPr>
+              <w:lastRenderedPageBreak/>
               <w:t>Colonne</w:t>
             </w:r>
           </w:p>
@@ -9320,13 +9640,1203 @@
       <w:pPr>
         <w:jc w:val="both"/>
       </w:pPr>
-    </w:p>
-    <w:p>
-      <w:pPr>
-        <w:jc w:val="both"/>
-      </w:pPr>
-      <w:r>
+      <w:r>
+        <w:pict w14:anchorId="77E1C897">
+          <v:rect id="_x0000_i1044" style="width:0;height:1.5pt" o:hralign="center" o:hrstd="t" o:hr="t" fillcolor="#a0a0a0" stroked="f"/>
+        </w:pict>
+      </w:r>
+    </w:p>
+    <w:p>
+      <w:pPr>
+        <w:jc w:val="center"/>
+        <w:rPr>
+          <w:b/>
+          <w:bCs/>
+          <w:color w:val="EE0000"/>
+        </w:rPr>
+      </w:pPr>
+      <w:r>
+        <w:rPr>
+          <w:b/>
+          <w:bCs/>
+          <w:color w:val="EE0000"/>
+        </w:rPr>
+        <w:t>RESUME DES ETL</w:t>
+      </w:r>
+    </w:p>
+    <w:p>
+      <w:pPr>
+        <w:jc w:val="both"/>
+        <w:rPr>
+          <w:b/>
+          <w:bCs/>
+        </w:rPr>
+      </w:pPr>
+      <w:r>
+        <w:pict w14:anchorId="2BD952F3">
+          <v:rect id="_x0000_i1045" style="width:0;height:1.5pt" o:hralign="center" o:hrstd="t" o:hr="t" fillcolor="#a0a0a0" stroked="f"/>
+        </w:pict>
+      </w:r>
+    </w:p>
+    <w:p>
+      <w:pPr>
+        <w:jc w:val="both"/>
+        <w:rPr>
+          <w:b/>
+          <w:bCs/>
+        </w:rPr>
+      </w:pPr>
+      <w:r>
+        <w:rPr>
+          <w:b/>
+          <w:bCs/>
+        </w:rPr>
+        <w:t>Note globale – Pipeline P_D_DATE</w:t>
+      </w:r>
+    </w:p>
+    <w:p>
+      <w:pPr>
+        <w:jc w:val="both"/>
+      </w:pPr>
+      <w:r>
+        <w:t>Le pipeline P_D_DATE construit la dimension temporelle D_DATE à partir des dates issues des tables ACHAT et LOCATION du système source Oracle.</w:t>
+      </w:r>
+    </w:p>
+    <w:p>
+      <w:pPr>
+        <w:jc w:val="both"/>
+      </w:pPr>
+      <w:r>
+        <w:t>Les dates sont dédupliquées puis enrichies par le calcul des attributs calendaires (jour, mois, année, semaine, trimestre, jour de la semaine, indicateur week-end).</w:t>
+      </w:r>
+    </w:p>
+    <w:p>
+      <w:pPr>
+        <w:jc w:val="both"/>
+      </w:pPr>
+      <w:r>
+        <w:t>Les calculs sont réalisés dans l’ETL afin de garantir la cohérence des indicateurs analytiques.</w:t>
+      </w:r>
+    </w:p>
+    <w:p>
+      <w:pPr>
+        <w:jc w:val="both"/>
+      </w:pPr>
+      <w:r>
+        <w:t xml:space="preserve">Le chargement dans MySQL est effectué via une étape Insert / Update basée sur la clé métier </w:t>
+      </w:r>
+      <w:proofErr w:type="spellStart"/>
+      <w:r>
+        <w:t>date_jour</w:t>
+      </w:r>
+      <w:proofErr w:type="spellEnd"/>
+      <w:r>
+        <w:t>, garantissant un chargement idempotent.</w:t>
+      </w:r>
+    </w:p>
+    <w:p>
+      <w:pPr>
+        <w:jc w:val="both"/>
+      </w:pPr>
+      <w:r>
+        <w:t>La dimension D_DATE est utilisée par les tables de faits pour les analyses temporelles dans Power BI.</w:t>
+      </w:r>
+    </w:p>
+    <w:p>
+      <w:pPr>
+        <w:jc w:val="both"/>
+        <w:rPr>
+          <w:b/>
+          <w:bCs/>
+        </w:rPr>
+      </w:pPr>
+      <w:r>
+        <w:rPr>
+          <w:b/>
+          <w:bCs/>
+        </w:rPr>
+        <w:t>Note globale – Pipeline P_D_LOCALISATION</w:t>
+      </w:r>
+    </w:p>
+    <w:p>
+      <w:pPr>
+        <w:jc w:val="both"/>
+      </w:pPr>
+    </w:p>
+    <w:p>
+      <w:pPr>
+        <w:jc w:val="both"/>
+      </w:pPr>
+      <w:r>
+        <w:t>Le pipeline P_D_LOCALISATION construit la dimension D_LOCALISATION à partir des tables VILLE et DEPARTEMENT du système source Oracle.</w:t>
+      </w:r>
+    </w:p>
+    <w:p>
+      <w:pPr>
+        <w:jc w:val="both"/>
+      </w:pPr>
+      <w:r>
+        <w:t>Les données de localisation sont nettoyées et harmonisées dans l’ETL, puis enrichies avec la région via une table de mapping dédiée (MAP_DPT_REGION).</w:t>
+      </w:r>
+    </w:p>
+    <w:p>
+      <w:pPr>
+        <w:jc w:val="both"/>
+      </w:pPr>
+      <w:r>
+        <w:t xml:space="preserve">La conversion département → région est réalisée par un </w:t>
+      </w:r>
+      <w:proofErr w:type="spellStart"/>
+      <w:r>
+        <w:t>Database</w:t>
+      </w:r>
+      <w:proofErr w:type="spellEnd"/>
+      <w:r>
+        <w:t xml:space="preserve"> </w:t>
+      </w:r>
+      <w:proofErr w:type="spellStart"/>
+      <w:r>
+        <w:t>Lookup</w:t>
+      </w:r>
+      <w:proofErr w:type="spellEnd"/>
+      <w:r>
+        <w:t>, séparant clairement la logique métier de la source.</w:t>
+      </w:r>
+    </w:p>
+    <w:p>
+      <w:pPr>
+        <w:jc w:val="both"/>
+      </w:pPr>
+      <w:r>
+        <w:t>Le chargement dans MySQL est effectué via une étape Insert / Update basée sur la clé métier ID_VILLE_SRC, garantissant un chargement idempotent.</w:t>
+      </w:r>
+    </w:p>
+    <w:p>
+      <w:pPr>
+        <w:jc w:val="both"/>
+      </w:pPr>
+      <w:r>
+        <w:t>La dimension D_LOCALISATION est utilisée par les dimensions et tables de faits pour les analyses géographiques dans Power BI.</w:t>
+      </w:r>
+    </w:p>
+    <w:p>
+      <w:pPr>
+        <w:jc w:val="both"/>
+        <w:rPr>
+          <w:b/>
+          <w:bCs/>
+        </w:rPr>
+      </w:pPr>
+      <w:r>
+        <w:rPr>
+          <w:b/>
+          <w:bCs/>
+        </w:rPr>
+        <w:t>Note globale – Pipeline P_D_CLIENT</w:t>
+      </w:r>
+    </w:p>
+    <w:p>
+      <w:pPr>
+        <w:jc w:val="both"/>
+      </w:pPr>
+      <w:r>
+        <w:t>Le pipeline P_D_CLIENT construit la dimension D_CLIENT à partir de la table CLIENT Oracle.</w:t>
+      </w:r>
+    </w:p>
+    <w:p>
+      <w:pPr>
+        <w:jc w:val="both"/>
+      </w:pPr>
+      <w:r>
+        <w:t>Les données sont enrichies dans l’ETL par le calcul de l’âge, de la tranche d’âge, de la civilité et du sexe.</w:t>
+      </w:r>
+    </w:p>
+    <w:p>
+      <w:pPr>
+        <w:jc w:val="both"/>
+      </w:pPr>
+      <w:r>
+        <w:t xml:space="preserve">Chaque client est rattaché à sa localisation via un </w:t>
+      </w:r>
+      <w:proofErr w:type="spellStart"/>
+      <w:r>
+        <w:t>Database</w:t>
+      </w:r>
+      <w:proofErr w:type="spellEnd"/>
+      <w:r>
+        <w:t xml:space="preserve"> </w:t>
+      </w:r>
+      <w:proofErr w:type="spellStart"/>
+      <w:r>
+        <w:t>Lookup</w:t>
+      </w:r>
+      <w:proofErr w:type="spellEnd"/>
+      <w:r>
+        <w:t xml:space="preserve"> vers la dimension D_LOCALISATION, permettant la conversion de l’identifiant de ville source en clé technique SK_LOCALISATION.</w:t>
+      </w:r>
+    </w:p>
+    <w:p>
+      <w:pPr>
+        <w:jc w:val="both"/>
+      </w:pPr>
+      <w:r>
+        <w:t>Le chargement dans MySQL est réalisé via une étape Insert / Update basée sur la clé métier ID_CLIENT_SRC, garantissant un chargement idempotent sans doublons.</w:t>
+      </w:r>
+    </w:p>
+    <w:p>
+      <w:pPr>
+        <w:jc w:val="both"/>
+      </w:pPr>
+      <w:r>
+        <w:t>La dimension D_CLIENT est utilisée par les tables de faits pour l’analyse décisionnelle dans Power BI.</w:t>
+      </w:r>
+    </w:p>
+    <w:p>
+      <w:pPr>
+        <w:jc w:val="both"/>
+        <w:rPr>
+          <w:b/>
+          <w:bCs/>
+        </w:rPr>
+      </w:pPr>
+      <w:r>
+        <w:rPr>
+          <w:b/>
+          <w:bCs/>
+        </w:rPr>
+        <w:t>Note – Pipeline P_D_AGENT</w:t>
+      </w:r>
+    </w:p>
+    <w:p>
+      <w:pPr>
+        <w:jc w:val="both"/>
+      </w:pPr>
+      <w:r>
+        <w:t>Le pipeline P_D_AGENT alimente la dimension D_AGENT à partir de la table AGENT du système source Oracle.</w:t>
+      </w:r>
+      <w:r>
+        <w:t xml:space="preserve"> </w:t>
+      </w:r>
+      <w:r>
+        <w:t>Chaque agent est identifié par son identifiant métier ID_AGENT_SRC, utilisé comme clé de correspondance avec l’entrepôt.</w:t>
+      </w:r>
+    </w:p>
+    <w:p>
+      <w:pPr>
+        <w:jc w:val="both"/>
+      </w:pPr>
+      <w:r>
+        <w:t>Le chargement est réalisé via une étape Insert / Update afin de garantir l’idempotence du pipeline :</w:t>
+      </w:r>
+      <w:r>
+        <w:t xml:space="preserve"> </w:t>
+      </w:r>
+      <w:r>
+        <w:t>si l’agent n’existe pas encore dans l’entrepôt, une nouvelle ligne est insérée et la clé technique SK_AGENT est générée automatiquement,</w:t>
+      </w:r>
+      <w:r>
+        <w:t xml:space="preserve"> </w:t>
+      </w:r>
+      <w:r>
+        <w:t>si l’agent existe déjà, ses informations (nom, prénom) sont mises à jour si nécessaire.</w:t>
+      </w:r>
+    </w:p>
+    <w:p>
+      <w:pPr>
+        <w:jc w:val="both"/>
+      </w:pPr>
+      <w:r>
+        <w:t>Cette approche permet de relancer le pipeline sans créer de doublons et d’assurer une correspondance stable entre les identifiants métiers Oracle et les clés techniques utilisées dans les tables de faits.</w:t>
+      </w:r>
+    </w:p>
+    <w:p>
+      <w:pPr>
+        <w:jc w:val="both"/>
+      </w:pPr>
+      <w:r>
+        <w:rPr>
+          <w:b/>
+          <w:bCs/>
+        </w:rPr>
         <w:lastRenderedPageBreak/>
+        <w:t>Note globale – Pipeline P_D_BIEN</w:t>
+      </w:r>
+    </w:p>
+    <w:p>
+      <w:pPr>
+        <w:jc w:val="both"/>
+      </w:pPr>
+      <w:r>
+        <w:t>Le pipeline P_D_BIEN construit la dimension D_BIEN à partir de la table BIEN de la base Oracle.</w:t>
+      </w:r>
+    </w:p>
+    <w:p>
+      <w:pPr>
+        <w:jc w:val="both"/>
+      </w:pPr>
+      <w:r>
+        <w:t>Les informations descriptives du bien (adresse, code postal, surface, nombre de pièces, prix)</w:t>
+      </w:r>
+      <w:r>
+        <w:t xml:space="preserve"> </w:t>
+      </w:r>
+      <w:r>
+        <w:t>sont enrichies dans l’ETL avec les référentiels TYPE_BIEN et ETAT.</w:t>
+      </w:r>
+    </w:p>
+    <w:p>
+      <w:pPr>
+        <w:jc w:val="both"/>
+      </w:pPr>
+      <w:r>
+        <w:t xml:space="preserve">Les attributs </w:t>
+      </w:r>
+      <w:proofErr w:type="spellStart"/>
+      <w:r>
+        <w:t>type_nom</w:t>
+      </w:r>
+      <w:proofErr w:type="spellEnd"/>
+      <w:r>
+        <w:t xml:space="preserve"> / </w:t>
+      </w:r>
+      <w:proofErr w:type="spellStart"/>
+      <w:r>
+        <w:t>type_id_src</w:t>
+      </w:r>
+      <w:proofErr w:type="spellEnd"/>
+      <w:r>
+        <w:t xml:space="preserve"> et </w:t>
+      </w:r>
+      <w:proofErr w:type="spellStart"/>
+      <w:r>
+        <w:t>etat_nom</w:t>
+      </w:r>
+      <w:proofErr w:type="spellEnd"/>
+      <w:r>
+        <w:t xml:space="preserve"> / </w:t>
+      </w:r>
+      <w:proofErr w:type="spellStart"/>
+      <w:r>
+        <w:t>etat_id_src</w:t>
+      </w:r>
+      <w:proofErr w:type="spellEnd"/>
+      <w:r>
+        <w:t xml:space="preserve"> sont intégrés directement</w:t>
+      </w:r>
+      <w:r>
+        <w:t xml:space="preserve"> </w:t>
+      </w:r>
+      <w:r>
+        <w:t>dans la dimension afin d’éviter la création de dimensions de faible cardinalité.</w:t>
+      </w:r>
+    </w:p>
+    <w:p>
+      <w:pPr>
+        <w:jc w:val="both"/>
+      </w:pPr>
+      <w:r>
+        <w:t>Des indicateurs métier sont calculés dans l’ETL :</w:t>
+      </w:r>
+    </w:p>
+    <w:p>
+      <w:pPr>
+        <w:jc w:val="both"/>
+      </w:pPr>
+      <w:r>
+        <w:t xml:space="preserve">- </w:t>
+      </w:r>
+      <w:proofErr w:type="spellStart"/>
+      <w:r>
+        <w:t>est_a_renover</w:t>
+      </w:r>
+      <w:proofErr w:type="spellEnd"/>
+    </w:p>
+    <w:p>
+      <w:pPr>
+        <w:jc w:val="both"/>
+      </w:pPr>
+      <w:r>
+        <w:t xml:space="preserve">- </w:t>
+      </w:r>
+      <w:proofErr w:type="spellStart"/>
+      <w:r>
+        <w:t>est_garage</w:t>
+      </w:r>
+      <w:proofErr w:type="spellEnd"/>
+    </w:p>
+    <w:p>
+      <w:pPr>
+        <w:jc w:val="both"/>
+      </w:pPr>
+      <w:r>
+        <w:t>Ces indicateurs sont stockés sous forme booléenne (0 / 1).</w:t>
+      </w:r>
+    </w:p>
+    <w:p>
+      <w:pPr>
+        <w:jc w:val="both"/>
+      </w:pPr>
+      <w:r>
+        <w:t xml:space="preserve">Chaque bien est rattaché à sa localisation via un </w:t>
+      </w:r>
+      <w:proofErr w:type="spellStart"/>
+      <w:r>
+        <w:t>Database</w:t>
+      </w:r>
+      <w:proofErr w:type="spellEnd"/>
+      <w:r>
+        <w:t xml:space="preserve"> </w:t>
+      </w:r>
+      <w:proofErr w:type="spellStart"/>
+      <w:r>
+        <w:t>Lookup</w:t>
+      </w:r>
+      <w:proofErr w:type="spellEnd"/>
+      <w:r>
+        <w:t xml:space="preserve"> vers la dimension</w:t>
+      </w:r>
+      <w:r>
+        <w:t xml:space="preserve"> </w:t>
+      </w:r>
+      <w:r>
+        <w:t>D_LOCALISATION, permettant la conversion de l’identifiant de ville source en clé technique</w:t>
+      </w:r>
+      <w:r>
+        <w:t xml:space="preserve"> </w:t>
+      </w:r>
+      <w:r>
+        <w:t>SK_LOCALISATION.</w:t>
+      </w:r>
+    </w:p>
+    <w:p>
+      <w:pPr>
+        <w:jc w:val="both"/>
+      </w:pPr>
+      <w:r>
+        <w:t>Le chargement dans MySQL est réalisé via une étape Insert / Update basée sur la clé métier</w:t>
+      </w:r>
+      <w:r>
+        <w:t xml:space="preserve"> </w:t>
+      </w:r>
+      <w:r>
+        <w:t>ID_BIEN_SRC, garantissant un chargement idempotent sans doublons.</w:t>
+      </w:r>
+    </w:p>
+    <w:p>
+      <w:pPr>
+        <w:jc w:val="both"/>
+      </w:pPr>
+      <w:r>
+        <w:t xml:space="preserve"> </w:t>
+      </w:r>
+      <w:r>
+        <w:t>La clé technique SK_BIEN est générée automatiquement par l’entrepôt.</w:t>
+      </w:r>
+    </w:p>
+    <w:p>
+      <w:pPr>
+        <w:jc w:val="both"/>
+        <w:rPr>
+          <w:b/>
+          <w:bCs/>
+        </w:rPr>
+      </w:pPr>
+      <w:r>
+        <w:rPr>
+          <w:b/>
+          <w:bCs/>
+        </w:rPr>
+        <w:t>Note globale – Pipeline P_D_BIEN_LOT</w:t>
+      </w:r>
+    </w:p>
+    <w:p>
+      <w:pPr>
+        <w:jc w:val="both"/>
+      </w:pPr>
+      <w:r>
+        <w:t xml:space="preserve">Le pipeline P_D_BIEN_LOT gère la relation hiérarchique entre les biens appartenant à un </w:t>
+      </w:r>
+      <w:proofErr w:type="spellStart"/>
+      <w:proofErr w:type="gramStart"/>
+      <w:r>
+        <w:t>lot.Dans</w:t>
+      </w:r>
+      <w:proofErr w:type="spellEnd"/>
+      <w:proofErr w:type="gramEnd"/>
+      <w:r>
+        <w:t xml:space="preserve"> le système source Oracle, la relation est exprimée via l’identifiant ID_LOT,</w:t>
+      </w:r>
+      <w:r>
+        <w:t xml:space="preserve"> </w:t>
+      </w:r>
+      <w:r>
+        <w:t>qui référence un autre bien.</w:t>
+      </w:r>
+    </w:p>
+    <w:p>
+      <w:pPr>
+        <w:jc w:val="both"/>
+      </w:pPr>
+      <w:r>
+        <w:t>Ce pipeline est exécuté après le chargement de la dimension D_BIEN afin de garantir</w:t>
+      </w:r>
+      <w:r>
+        <w:t xml:space="preserve"> </w:t>
+      </w:r>
+      <w:r>
+        <w:t>la disponibilité des clés techniques.</w:t>
+      </w:r>
+    </w:p>
+    <w:p>
+      <w:pPr>
+        <w:jc w:val="both"/>
+      </w:pPr>
+      <w:r>
+        <w:t>Les identifiants métiers sont traduits comme suit :</w:t>
+      </w:r>
+    </w:p>
+    <w:p>
+      <w:pPr>
+        <w:jc w:val="both"/>
+      </w:pPr>
+      <w:r>
+        <w:t>- ID_LOT_SRC (Oracle) → SK_BIEN (clé technique du bien parent)</w:t>
+      </w:r>
+    </w:p>
+    <w:p>
+      <w:pPr>
+        <w:jc w:val="both"/>
+      </w:pPr>
+      <w:r>
+        <w:t>La colonne LOT_PARENT_SK_BIEN de D_BIEN est ensuite mise à jour à l’aide d’un Insert / Update.</w:t>
+      </w:r>
+    </w:p>
+    <w:p>
+      <w:pPr>
+        <w:jc w:val="both"/>
+      </w:pPr>
+      <w:r>
+        <w:t>Cette approche permet :</w:t>
+      </w:r>
+    </w:p>
+    <w:p>
+      <w:pPr>
+        <w:jc w:val="both"/>
+      </w:pPr>
+      <w:r>
+        <w:t>- d’éviter les dépendances circulaires lors du chargement initial,</w:t>
+      </w:r>
+    </w:p>
+    <w:p>
+      <w:pPr>
+        <w:jc w:val="both"/>
+      </w:pPr>
+      <w:r>
+        <w:t>- de conserver une relation hiérarchique stable en clé technique,</w:t>
+      </w:r>
+    </w:p>
+    <w:p>
+      <w:pPr>
+        <w:jc w:val="both"/>
+      </w:pPr>
+      <w:r>
+        <w:t>- de garantir la relance du pipeline sans incohérence.</w:t>
+      </w:r>
+    </w:p>
+    <w:p>
+      <w:pPr>
+        <w:jc w:val="both"/>
+      </w:pPr>
+    </w:p>
+    <w:p>
+      <w:pPr>
+        <w:jc w:val="both"/>
+      </w:pPr>
+      <w:r>
+        <w:t>La hiérarchie des biens est ainsi prête à être exploitée dans les analyses décisionnelles.</w:t>
+      </w:r>
+      <w:r>
+        <w:t xml:space="preserve"> </w:t>
+      </w:r>
+      <w:r>
+        <w:t>En complément de la gestion hiérarchique, le pipeline intègre une règle métier permettant</w:t>
+      </w:r>
+      <w:r>
+        <w:t xml:space="preserve"> </w:t>
+      </w:r>
+      <w:r>
+        <w:t>d’identifier les biens disposant d’un lot supplémentaire de type garage.</w:t>
+      </w:r>
+    </w:p>
+    <w:p>
+      <w:pPr>
+        <w:jc w:val="both"/>
+      </w:pPr>
+      <w:r>
+        <w:t>Lorsqu’un bien enfant de type GARAGE est rattaché à un bien parent via ID_LOT_SRC,</w:t>
+      </w:r>
+      <w:r>
+        <w:t xml:space="preserve"> </w:t>
+      </w:r>
+      <w:r>
+        <w:t>le booléen LOT_AVEC_GARAGE est positionné à 1 sur le bien parent dans la dimension D_BIEN.</w:t>
+      </w:r>
+    </w:p>
+    <w:p>
+      <w:pPr>
+        <w:jc w:val="both"/>
+        <w:rPr>
+          <w:b/>
+          <w:bCs/>
+        </w:rPr>
+      </w:pPr>
+      <w:r>
+        <w:rPr>
+          <w:b/>
+          <w:bCs/>
+        </w:rPr>
+        <w:t>Note – Pipeline P_F_ACHAT</w:t>
+      </w:r>
+    </w:p>
+    <w:p>
+      <w:pPr>
+        <w:jc w:val="both"/>
+      </w:pPr>
+      <w:r>
+        <w:t xml:space="preserve">Ce pipeline alimente la table de faits </w:t>
+      </w:r>
+      <w:r>
+        <w:rPr>
+          <w:b/>
+          <w:bCs/>
+        </w:rPr>
+        <w:t>F_ACHAT</w:t>
+      </w:r>
+      <w:r>
+        <w:t>, qui enregistre les transactions d’achat immobilier.</w:t>
+      </w:r>
+    </w:p>
+    <w:p>
+      <w:pPr>
+        <w:jc w:val="both"/>
+      </w:pPr>
+      <w:r>
+        <w:t xml:space="preserve">Les données sont extraites depuis la table </w:t>
+      </w:r>
+      <w:r>
+        <w:rPr>
+          <w:b/>
+          <w:bCs/>
+        </w:rPr>
+        <w:t>ACHAT</w:t>
+      </w:r>
+      <w:r>
+        <w:t xml:space="preserve"> du système source Oracle.</w:t>
+      </w:r>
+    </w:p>
+    <w:p>
+      <w:pPr>
+        <w:jc w:val="both"/>
+      </w:pPr>
+      <w:r>
+        <w:t>Le pipeline consiste à :</w:t>
+      </w:r>
+    </w:p>
+    <w:p>
+      <w:pPr>
+        <w:numPr>
+          <w:ilvl w:val="0"/>
+          <w:numId w:val="28"/>
+        </w:numPr>
+        <w:jc w:val="both"/>
+      </w:pPr>
+      <w:proofErr w:type="gramStart"/>
+      <w:r>
+        <w:t>traduire</w:t>
+      </w:r>
+      <w:proofErr w:type="gramEnd"/>
+      <w:r>
+        <w:t xml:space="preserve"> les identifiants métier en clés techniques via des </w:t>
+      </w:r>
+      <w:proofErr w:type="spellStart"/>
+      <w:r>
+        <w:t>lookups</w:t>
+      </w:r>
+      <w:proofErr w:type="spellEnd"/>
+      <w:r>
+        <w:t xml:space="preserve"> vers les dimensions </w:t>
+      </w:r>
+      <w:r>
+        <w:rPr>
+          <w:b/>
+          <w:bCs/>
+        </w:rPr>
+        <w:t>D_DATE</w:t>
+      </w:r>
+      <w:r>
+        <w:t xml:space="preserve">, </w:t>
+      </w:r>
+      <w:r>
+        <w:rPr>
+          <w:b/>
+          <w:bCs/>
+        </w:rPr>
+        <w:t>D_CLIENT</w:t>
+      </w:r>
+      <w:r>
+        <w:t xml:space="preserve">, </w:t>
+      </w:r>
+      <w:r>
+        <w:rPr>
+          <w:b/>
+          <w:bCs/>
+        </w:rPr>
+        <w:t>D_AGENT</w:t>
+      </w:r>
+      <w:r>
+        <w:t xml:space="preserve"> et </w:t>
+      </w:r>
+      <w:r>
+        <w:rPr>
+          <w:b/>
+          <w:bCs/>
+        </w:rPr>
+        <w:t>D_BIEN</w:t>
+      </w:r>
+      <w:r>
+        <w:t xml:space="preserve">, </w:t>
+      </w:r>
+    </w:p>
+    <w:p>
+      <w:pPr>
+        <w:numPr>
+          <w:ilvl w:val="0"/>
+          <w:numId w:val="28"/>
+        </w:numPr>
+        <w:jc w:val="both"/>
+      </w:pPr>
+      <w:proofErr w:type="gramStart"/>
+      <w:r>
+        <w:t>récupérer</w:t>
+      </w:r>
+      <w:proofErr w:type="gramEnd"/>
+      <w:r>
+        <w:t xml:space="preserve"> la localisation et les attributs du bien directement depuis </w:t>
+      </w:r>
+      <w:r>
+        <w:rPr>
+          <w:b/>
+          <w:bCs/>
+        </w:rPr>
+        <w:t>D_BIEN</w:t>
+      </w:r>
+      <w:r>
+        <w:t xml:space="preserve">, </w:t>
+      </w:r>
+    </w:p>
+    <w:p>
+      <w:pPr>
+        <w:numPr>
+          <w:ilvl w:val="0"/>
+          <w:numId w:val="28"/>
+        </w:numPr>
+        <w:jc w:val="both"/>
+      </w:pPr>
+      <w:proofErr w:type="gramStart"/>
+      <w:r>
+        <w:t>calculer</w:t>
+      </w:r>
+      <w:proofErr w:type="gramEnd"/>
+      <w:r>
+        <w:t xml:space="preserve"> des indicateurs métier tels que </w:t>
+      </w:r>
+      <w:r>
+        <w:rPr>
+          <w:b/>
+          <w:bCs/>
+        </w:rPr>
+        <w:t>ECART_PRIX</w:t>
+      </w:r>
+      <w:r>
+        <w:t xml:space="preserve">, </w:t>
+      </w:r>
+      <w:r>
+        <w:rPr>
+          <w:b/>
+          <w:bCs/>
+        </w:rPr>
+        <w:t>PRIX_ACHAT_M2</w:t>
+      </w:r>
+      <w:r>
+        <w:t xml:space="preserve"> et </w:t>
+      </w:r>
+      <w:r>
+        <w:rPr>
+          <w:b/>
+          <w:bCs/>
+        </w:rPr>
+        <w:t>DELAI_VISITE_ACHAT_JOURS</w:t>
+      </w:r>
+      <w:r>
+        <w:t xml:space="preserve">, </w:t>
+      </w:r>
+    </w:p>
+    <w:p>
+      <w:pPr>
+        <w:numPr>
+          <w:ilvl w:val="0"/>
+          <w:numId w:val="28"/>
+        </w:numPr>
+        <w:jc w:val="both"/>
+      </w:pPr>
+      <w:proofErr w:type="gramStart"/>
+      <w:r>
+        <w:t>charger</w:t>
+      </w:r>
+      <w:proofErr w:type="gramEnd"/>
+      <w:r>
+        <w:t xml:space="preserve"> les données dans </w:t>
+      </w:r>
+      <w:r>
+        <w:rPr>
+          <w:b/>
+          <w:bCs/>
+        </w:rPr>
+        <w:t>F_ACHAT</w:t>
+      </w:r>
+      <w:r>
+        <w:t xml:space="preserve"> via une étape </w:t>
+      </w:r>
+      <w:r>
+        <w:rPr>
+          <w:b/>
+          <w:bCs/>
+        </w:rPr>
+        <w:t>Insert / Update</w:t>
+      </w:r>
+      <w:r>
+        <w:t xml:space="preserve">. </w:t>
+      </w:r>
+    </w:p>
+    <w:p>
+      <w:pPr>
+        <w:jc w:val="both"/>
+      </w:pPr>
+      <w:r>
+        <w:t xml:space="preserve">La clé de localisation est dérivée de la dimension </w:t>
+      </w:r>
+      <w:r>
+        <w:rPr>
+          <w:b/>
+          <w:bCs/>
+        </w:rPr>
+        <w:t>D_BIEN</w:t>
+      </w:r>
+      <w:r>
+        <w:t xml:space="preserve">, garantissant la cohérence entre les faits et les dimensions sans </w:t>
+      </w:r>
+      <w:proofErr w:type="spellStart"/>
+      <w:r>
+        <w:t>lookup</w:t>
+      </w:r>
+      <w:proofErr w:type="spellEnd"/>
+      <w:r>
+        <w:t xml:space="preserve"> supplémentaire.</w:t>
+      </w:r>
+    </w:p>
+    <w:p>
+      <w:pPr>
+        <w:jc w:val="both"/>
+      </w:pPr>
+      <w:r>
+        <w:t xml:space="preserve">Cette approche permet de centraliser la logique métier dans l’ETL, d’assurer la cohérence des clés techniques et de garantir la </w:t>
+      </w:r>
+      <w:proofErr w:type="spellStart"/>
+      <w:r>
+        <w:t>relançabilité</w:t>
+      </w:r>
+      <w:proofErr w:type="spellEnd"/>
+      <w:r>
+        <w:t xml:space="preserve"> du pipeline sans création de doublons.</w:t>
+      </w:r>
+    </w:p>
+    <w:p>
+      <w:pPr>
+        <w:jc w:val="both"/>
+        <w:rPr>
+          <w:b/>
+          <w:bCs/>
+        </w:rPr>
+      </w:pPr>
+      <w:r>
+        <w:rPr>
+          <w:rFonts w:ascii="Segoe UI Emoji" w:hAnsi="Segoe UI Emoji" w:cs="Segoe UI Emoji"/>
+          <w:b/>
+          <w:bCs/>
+        </w:rPr>
+        <w:t>📝</w:t>
+      </w:r>
+      <w:r>
+        <w:rPr>
+          <w:b/>
+          <w:bCs/>
+        </w:rPr>
+        <w:t xml:space="preserve"> Note – Pipeline P_F_LOCATION</w:t>
+      </w:r>
+    </w:p>
+    <w:p>
+      <w:pPr>
+        <w:jc w:val="both"/>
+      </w:pPr>
+      <w:r>
+        <w:t xml:space="preserve">Ce pipeline alimente la table de faits </w:t>
+      </w:r>
+      <w:r>
+        <w:rPr>
+          <w:b/>
+          <w:bCs/>
+        </w:rPr>
+        <w:t>F_LOCATION</w:t>
+      </w:r>
+      <w:r>
+        <w:t>, qui enregistre les événements de location immobilière.</w:t>
+      </w:r>
+    </w:p>
+    <w:p>
+      <w:pPr>
+        <w:jc w:val="both"/>
+      </w:pPr>
+      <w:r>
+        <w:t xml:space="preserve">Les données sont extraites depuis la table </w:t>
+      </w:r>
+      <w:r>
+        <w:rPr>
+          <w:b/>
+          <w:bCs/>
+        </w:rPr>
+        <w:t>LOCATION</w:t>
+      </w:r>
+      <w:r>
+        <w:t xml:space="preserve"> du système source Oracle.</w:t>
+      </w:r>
+    </w:p>
+    <w:p>
+      <w:pPr>
+        <w:jc w:val="both"/>
+      </w:pPr>
+      <w:r>
+        <w:t>Le pipeline consiste à :</w:t>
+      </w:r>
+    </w:p>
+    <w:p>
+      <w:pPr>
+        <w:numPr>
+          <w:ilvl w:val="0"/>
+          <w:numId w:val="29"/>
+        </w:numPr>
+        <w:jc w:val="both"/>
+      </w:pPr>
+      <w:proofErr w:type="gramStart"/>
+      <w:r>
+        <w:t>traduire</w:t>
+      </w:r>
+      <w:proofErr w:type="gramEnd"/>
+      <w:r>
+        <w:t xml:space="preserve"> les identifiants métier en clés techniques via des </w:t>
+      </w:r>
+      <w:proofErr w:type="spellStart"/>
+      <w:r>
+        <w:t>lookups</w:t>
+      </w:r>
+      <w:proofErr w:type="spellEnd"/>
+      <w:r>
+        <w:t xml:space="preserve"> vers les dimensions </w:t>
+      </w:r>
+      <w:r>
+        <w:rPr>
+          <w:b/>
+          <w:bCs/>
+        </w:rPr>
+        <w:t>D_DATE</w:t>
+      </w:r>
+      <w:r>
+        <w:t xml:space="preserve">, </w:t>
+      </w:r>
+      <w:r>
+        <w:rPr>
+          <w:b/>
+          <w:bCs/>
+        </w:rPr>
+        <w:t>D_CLIENT</w:t>
+      </w:r>
+      <w:r>
+        <w:t xml:space="preserve">, </w:t>
+      </w:r>
+      <w:r>
+        <w:rPr>
+          <w:b/>
+          <w:bCs/>
+        </w:rPr>
+        <w:t>D_AGENT</w:t>
+      </w:r>
+      <w:r>
+        <w:t xml:space="preserve"> et </w:t>
+      </w:r>
+      <w:r>
+        <w:rPr>
+          <w:b/>
+          <w:bCs/>
+        </w:rPr>
+        <w:t>D_BIEN</w:t>
+      </w:r>
+      <w:r>
+        <w:t xml:space="preserve">, </w:t>
+      </w:r>
+    </w:p>
+    <w:p>
+      <w:pPr>
+        <w:numPr>
+          <w:ilvl w:val="0"/>
+          <w:numId w:val="29"/>
+        </w:numPr>
+        <w:jc w:val="both"/>
+      </w:pPr>
+      <w:proofErr w:type="gramStart"/>
+      <w:r>
+        <w:t>récupérer</w:t>
+      </w:r>
+      <w:proofErr w:type="gramEnd"/>
+      <w:r>
+        <w:t xml:space="preserve"> la clé de localisation directement depuis la dimension </w:t>
+      </w:r>
+      <w:r>
+        <w:rPr>
+          <w:b/>
+          <w:bCs/>
+        </w:rPr>
+        <w:t>D_BIEN</w:t>
+      </w:r>
+      <w:r>
+        <w:t xml:space="preserve">, </w:t>
+      </w:r>
+    </w:p>
+    <w:p>
+      <w:pPr>
+        <w:numPr>
+          <w:ilvl w:val="0"/>
+          <w:numId w:val="29"/>
+        </w:numPr>
+        <w:jc w:val="both"/>
+      </w:pPr>
+      <w:proofErr w:type="gramStart"/>
+      <w:r>
+        <w:lastRenderedPageBreak/>
+        <w:t>calculer</w:t>
+      </w:r>
+      <w:proofErr w:type="gramEnd"/>
+      <w:r>
+        <w:t xml:space="preserve"> l’indicateur métier </w:t>
+      </w:r>
+      <w:r>
+        <w:rPr>
+          <w:b/>
+          <w:bCs/>
+        </w:rPr>
+        <w:t>DELAI_VISITE_LOCATION_JOURS</w:t>
+      </w:r>
+      <w:r>
+        <w:t xml:space="preserve">, correspondant au délai entre la visite et la location, </w:t>
+      </w:r>
+    </w:p>
+    <w:p>
+      <w:pPr>
+        <w:numPr>
+          <w:ilvl w:val="0"/>
+          <w:numId w:val="29"/>
+        </w:numPr>
+        <w:jc w:val="both"/>
+      </w:pPr>
+      <w:proofErr w:type="gramStart"/>
+      <w:r>
+        <w:t>charger</w:t>
+      </w:r>
+      <w:proofErr w:type="gramEnd"/>
+      <w:r>
+        <w:t xml:space="preserve"> les données dans </w:t>
+      </w:r>
+      <w:r>
+        <w:rPr>
+          <w:b/>
+          <w:bCs/>
+        </w:rPr>
+        <w:t>F_LOCATION</w:t>
+      </w:r>
+      <w:r>
+        <w:t xml:space="preserve"> via une étape </w:t>
+      </w:r>
+      <w:r>
+        <w:rPr>
+          <w:b/>
+          <w:bCs/>
+        </w:rPr>
+        <w:t>Insert / Update</w:t>
+      </w:r>
+      <w:r>
+        <w:t xml:space="preserve">. </w:t>
+      </w:r>
+    </w:p>
+    <w:p>
+      <w:pPr>
+        <w:jc w:val="both"/>
+      </w:pPr>
+      <w:r>
+        <w:t xml:space="preserve">La clé de localisation est dérivée de la dimension </w:t>
+      </w:r>
+      <w:r>
+        <w:rPr>
+          <w:b/>
+          <w:bCs/>
+        </w:rPr>
+        <w:t>D_BIEN</w:t>
+      </w:r>
+      <w:r>
+        <w:t xml:space="preserve">, garantissant la cohérence entre les faits et les dimensions sans </w:t>
+      </w:r>
+      <w:proofErr w:type="spellStart"/>
+      <w:r>
+        <w:t>lookup</w:t>
+      </w:r>
+      <w:proofErr w:type="spellEnd"/>
+      <w:r>
+        <w:t xml:space="preserve"> supplémentaire.</w:t>
+      </w:r>
+    </w:p>
+    <w:p>
+      <w:pPr>
+        <w:jc w:val="both"/>
+      </w:pPr>
+      <w:r>
+        <w:t xml:space="preserve">Cette approche permet de centraliser la logique métier dans l’ETL, d’assurer la cohérence des clés techniques et de garantir la </w:t>
+      </w:r>
+      <w:proofErr w:type="spellStart"/>
+      <w:r>
+        <w:t>relançabilité</w:t>
+      </w:r>
+      <w:proofErr w:type="spellEnd"/>
+      <w:r>
+        <w:t xml:space="preserve"> du pipeline sans création de doublons.</w:t>
+      </w:r>
+    </w:p>
+    <w:p>
+      <w:pPr>
+        <w:jc w:val="both"/>
+      </w:pPr>
+    </w:p>
+    <w:p>
+      <w:pPr>
+        <w:jc w:val="both"/>
+      </w:pPr>
+      <w:r>
         <w:pict w14:anchorId="460D5BCB">
           <v:rect id="_x0000_i1035" style="width:0;height:1.5pt" o:hralign="center" o:hrstd="t" o:hr="t" fillcolor="#a0a0a0" stroked="f"/>
         </w:pict>
@@ -9685,14 +11195,9 @@
       <w:pPr>
         <w:jc w:val="both"/>
       </w:pPr>
-    </w:p>
-    <w:p>
-      <w:pPr>
-        <w:jc w:val="both"/>
-      </w:pPr>
       <w:r>
         <w:pict w14:anchorId="328A9BFA">
-          <v:rect id="_x0000_i1041" style="width:0;height:1.5pt" o:hralign="center" o:hrstd="t" o:hr="t" fillcolor="#a0a0a0" stroked="f"/>
+          <v:rect id="_x0000_i1037" style="width:0;height:1.5pt" o:hralign="center" o:hrstd="t" o:hr="t" fillcolor="#a0a0a0" stroked="f"/>
         </w:pict>
       </w:r>
     </w:p>
@@ -9711,7 +11216,23 @@
           <w:bCs/>
           <w:color w:val="EE0000"/>
         </w:rPr>
-        <w:t>Partie 2</w:t>
+        <w:t xml:space="preserve">Analyse </w:t>
+      </w:r>
+      <w:r>
+        <w:rPr>
+          <w:b/>
+          <w:bCs/>
+          <w:color w:val="EE0000"/>
+        </w:rPr>
+        <w:t>P</w:t>
+      </w:r>
+      <w:r>
+        <w:rPr>
+          <w:b/>
+          <w:bCs/>
+          <w:color w:val="EE0000"/>
+        </w:rPr>
+        <w:t>ower BI</w:t>
       </w:r>
     </w:p>
     <w:p>
@@ -9724,7 +11245,7 @@
       </w:pPr>
       <w:r>
         <w:pict w14:anchorId="0A8E9566">
-          <v:rect id="_x0000_i1042" style="width:0;height:1.5pt" o:hralign="center" o:hrstd="t" o:hr="t" fillcolor="#a0a0a0" stroked="f"/>
+          <v:rect id="_x0000_i1038" style="width:0;height:1.5pt" o:hralign="center" o:hrstd="t" o:hr="t" fillcolor="#a0a0a0" stroked="f"/>
         </w:pict>
       </w:r>
     </w:p>
@@ -9733,19 +11254,670 @@
         <w:jc w:val="both"/>
       </w:pPr>
       <w:r>
-        <w:t xml:space="preserve">Clé de substitution, on va créer une clé en plus pour gérer les doublons </w:t>
-      </w:r>
-      <w:r>
-        <w:t>erreur.</w:t>
-      </w:r>
-      <w:r>
-        <w:t xml:space="preserve"> Clé primaire du système </w:t>
+        <w:lastRenderedPageBreak/>
+        <w:t>Dans le cadre de l’analyse décisionnelle de l’agence immobilière, les indicateurs demandés ont été organisés sous forme de trois tableaux de bord thématiques dans Power BI. Cette organisation permet de structurer l’analyse selon les principaux axes métiers de l’agence : le pilotage global de l’activité, la performance commerciale des agents et l’analyse du portefeuille de biens et des profils clients.</w:t>
+      </w:r>
+    </w:p>
+    <w:p>
+      <w:pPr>
+        <w:jc w:val="both"/>
+      </w:pPr>
+      <w:r>
+        <w:t>Le premier tableau de bord, orienté direction, vise à fournir une vision synthétique de la performance globale de l’agence à travers l’évolution du chiffre d’affaires, l’activité de vente et de location, ainsi que certains indicateurs de marché comme les prix moyens et les délais de transaction.</w:t>
+      </w:r>
+    </w:p>
+    <w:p>
+      <w:pPr>
+        <w:jc w:val="both"/>
+      </w:pPr>
+      <w:r>
+        <w:t>Le second tableau de bord est dédié à l’analyse commerciale et met en évidence la performance des agents immobiliers, notamment à travers le chiffre d’affaires généré et l’écart entre le prix affiché et le prix négocié avec les clients.</w:t>
+      </w:r>
+    </w:p>
+    <w:p>
+      <w:pPr>
+        <w:jc w:val="both"/>
+      </w:pPr>
+      <w:r>
+        <w:t>Enfin, le troisième tableau de bord est consacré à l’analyse du portefeuille de biens et des caractéristiques de la clientèle. Il permet notamment d’observer la répartition des clients, l’état des biens proposés ainsi que certaines caractéristiques du stock immobilier, comme la présence de lots supplémentaires associés aux biens.</w:t>
+      </w:r>
+    </w:p>
+    <w:p>
+      <w:pPr>
+        <w:jc w:val="both"/>
+        <w:rPr>
+          <w:b/>
+          <w:bCs/>
+        </w:rPr>
+      </w:pPr>
+      <w:r>
+        <w:t>Cette organisation permet de faciliter la lecture des indicateurs, d’adapter l’analyse aux différents besoins métiers</w:t>
+      </w:r>
+      <w:r>
+        <w:rPr>
+          <w:b/>
+          <w:bCs/>
+        </w:rPr>
+        <w:t xml:space="preserve"> et de proposer une vision claire et structurée des données de l’agence.</w:t>
+      </w:r>
+    </w:p>
+    <w:p>
+      <w:pPr>
+        <w:jc w:val="both"/>
+        <w:rPr>
+          <w:b/>
+          <w:bCs/>
+        </w:rPr>
+      </w:pPr>
+    </w:p>
+    <w:p>
+      <w:pPr>
+        <w:jc w:val="both"/>
+        <w:rPr>
+          <w:b/>
+          <w:bCs/>
+        </w:rPr>
+      </w:pPr>
+      <w:r>
+        <w:rPr>
+          <w:b/>
+          <w:bCs/>
+          <w:noProof/>
+        </w:rPr>
+        <w:drawing>
+          <wp:inline distT="0" distB="0" distL="0" distR="0" wp14:anchorId="4EFA8009" wp14:editId="0F801A66">
+            <wp:extent cx="3436620" cy="1379220"/>
+            <wp:effectExtent l="19050" t="19050" r="11430" b="11430"/>
+            <wp:docPr id="824949819" name="Image 1"/>
+            <wp:cNvGraphicFramePr>
+              <a:graphicFrameLocks xmlns:a="http://schemas.openxmlformats.org/drawingml/2006/main" noChangeAspect="1"/>
+            </wp:cNvGraphicFramePr>
+            <a:graphic xmlns:a="http://schemas.openxmlformats.org/drawingml/2006/main">
+              <a:graphicData uri="http://schemas.openxmlformats.org/drawingml/2006/picture">
+                <pic:pic xmlns:pic="http://schemas.openxmlformats.org/drawingml/2006/picture">
+                  <pic:nvPicPr>
+                    <pic:cNvPr id="0" name="Picture 15"/>
+                    <pic:cNvPicPr>
+                      <a:picLocks noChangeAspect="1" noChangeArrowheads="1"/>
+                    </pic:cNvPicPr>
+                  </pic:nvPicPr>
+                  <pic:blipFill>
+                    <a:blip r:embed="rId14">
+                      <a:extLst>
+                        <a:ext uri="{28A0092B-C50C-407E-A947-70E740481C1C}">
+                          <a14:useLocalDpi xmlns:a14="http://schemas.microsoft.com/office/drawing/2010/main" val="0"/>
+                        </a:ext>
+                      </a:extLst>
+                    </a:blip>
+                    <a:srcRect/>
+                    <a:stretch>
+                      <a:fillRect/>
+                    </a:stretch>
+                  </pic:blipFill>
+                  <pic:spPr bwMode="auto">
+                    <a:xfrm>
+                      <a:off x="0" y="0"/>
+                      <a:ext cx="3436620" cy="1379220"/>
+                    </a:xfrm>
+                    <a:prstGeom prst="rect">
+                      <a:avLst/>
+                    </a:prstGeom>
+                    <a:noFill/>
+                    <a:ln>
+                      <a:solidFill>
+                        <a:schemeClr val="tx1"/>
+                      </a:solidFill>
+                    </a:ln>
+                  </pic:spPr>
+                </pic:pic>
+              </a:graphicData>
+            </a:graphic>
+          </wp:inline>
+        </w:drawing>
+      </w:r>
+    </w:p>
+    <w:p>
+      <w:pPr>
+        <w:jc w:val="both"/>
+        <w:rPr>
+          <w:b/>
+          <w:bCs/>
+        </w:rPr>
+      </w:pPr>
+      <w:r>
+        <w:rPr>
+          <w:b/>
+          <w:bCs/>
+          <w:noProof/>
+        </w:rPr>
+        <w:lastRenderedPageBreak/>
+        <w:drawing>
+          <wp:inline distT="0" distB="0" distL="0" distR="0" wp14:anchorId="544A3395" wp14:editId="0B653AEC">
+            <wp:extent cx="5509260" cy="3310890"/>
+            <wp:effectExtent l="19050" t="19050" r="15240" b="22860"/>
+            <wp:docPr id="414130600" name="Image 2"/>
+            <wp:cNvGraphicFramePr>
+              <a:graphicFrameLocks xmlns:a="http://schemas.openxmlformats.org/drawingml/2006/main" noChangeAspect="1"/>
+            </wp:cNvGraphicFramePr>
+            <a:graphic xmlns:a="http://schemas.openxmlformats.org/drawingml/2006/main">
+              <a:graphicData uri="http://schemas.openxmlformats.org/drawingml/2006/picture">
+                <pic:pic xmlns:pic="http://schemas.openxmlformats.org/drawingml/2006/picture">
+                  <pic:nvPicPr>
+                    <pic:cNvPr id="0" name="Picture 16"/>
+                    <pic:cNvPicPr>
+                      <a:picLocks noChangeAspect="1" noChangeArrowheads="1"/>
+                    </pic:cNvPicPr>
+                  </pic:nvPicPr>
+                  <pic:blipFill>
+                    <a:blip r:embed="rId15">
+                      <a:extLst>
+                        <a:ext uri="{28A0092B-C50C-407E-A947-70E740481C1C}">
+                          <a14:useLocalDpi xmlns:a14="http://schemas.microsoft.com/office/drawing/2010/main" val="0"/>
+                        </a:ext>
+                      </a:extLst>
+                    </a:blip>
+                    <a:srcRect/>
+                    <a:stretch>
+                      <a:fillRect/>
+                    </a:stretch>
+                  </pic:blipFill>
+                  <pic:spPr bwMode="auto">
+                    <a:xfrm>
+                      <a:off x="0" y="0"/>
+                      <a:ext cx="5509260" cy="3310890"/>
+                    </a:xfrm>
+                    <a:prstGeom prst="rect">
+                      <a:avLst/>
+                    </a:prstGeom>
+                    <a:noFill/>
+                    <a:ln>
+                      <a:solidFill>
+                        <a:schemeClr val="tx1"/>
+                      </a:solidFill>
+                    </a:ln>
+                  </pic:spPr>
+                </pic:pic>
+              </a:graphicData>
+            </a:graphic>
+          </wp:inline>
+        </w:drawing>
+      </w:r>
+    </w:p>
+    <w:p>
+      <w:pPr>
+        <w:rPr>
+          <w:b/>
+          <w:bCs/>
+        </w:rPr>
+      </w:pPr>
+      <w:r>
+        <w:rPr>
+          <w:b/>
+          <w:bCs/>
+        </w:rPr>
+        <w:t xml:space="preserve">Sur </w:t>
       </w:r>
       <w:proofErr w:type="spellStart"/>
       <w:r>
-        <w:t>operationnel</w:t>
+        <w:rPr>
+          <w:b/>
+          <w:bCs/>
+        </w:rPr>
+        <w:t>powerbi</w:t>
       </w:r>
       <w:proofErr w:type="spellEnd"/>
+    </w:p>
+    <w:p>
+      <w:pPr>
+        <w:rPr>
+          <w:b/>
+          <w:bCs/>
+        </w:rPr>
+      </w:pPr>
+      <w:r>
+        <w:rPr>
+          <w:b/>
+          <w:bCs/>
+          <w:noProof/>
+        </w:rPr>
+        <w:drawing>
+          <wp:inline distT="0" distB="0" distL="0" distR="0" wp14:anchorId="7437CC38" wp14:editId="0B3F1D3E">
+            <wp:extent cx="4754880" cy="1737360"/>
+            <wp:effectExtent l="0" t="0" r="7620" b="0"/>
+            <wp:docPr id="2133263438" name="Image 3"/>
+            <wp:cNvGraphicFramePr>
+              <a:graphicFrameLocks xmlns:a="http://schemas.openxmlformats.org/drawingml/2006/main" noChangeAspect="1"/>
+            </wp:cNvGraphicFramePr>
+            <a:graphic xmlns:a="http://schemas.openxmlformats.org/drawingml/2006/main">
+              <a:graphicData uri="http://schemas.openxmlformats.org/drawingml/2006/picture">
+                <pic:pic xmlns:pic="http://schemas.openxmlformats.org/drawingml/2006/picture">
+                  <pic:nvPicPr>
+                    <pic:cNvPr id="0" name="Picture 17"/>
+                    <pic:cNvPicPr>
+                      <a:picLocks noChangeAspect="1" noChangeArrowheads="1"/>
+                    </pic:cNvPicPr>
+                  </pic:nvPicPr>
+                  <pic:blipFill>
+                    <a:blip r:embed="rId16">
+                      <a:extLst>
+                        <a:ext uri="{28A0092B-C50C-407E-A947-70E740481C1C}">
+                          <a14:useLocalDpi xmlns:a14="http://schemas.microsoft.com/office/drawing/2010/main" val="0"/>
+                        </a:ext>
+                      </a:extLst>
+                    </a:blip>
+                    <a:srcRect/>
+                    <a:stretch>
+                      <a:fillRect/>
+                    </a:stretch>
+                  </pic:blipFill>
+                  <pic:spPr bwMode="auto">
+                    <a:xfrm>
+                      <a:off x="0" y="0"/>
+                      <a:ext cx="4754880" cy="1737360"/>
+                    </a:xfrm>
+                    <a:prstGeom prst="rect">
+                      <a:avLst/>
+                    </a:prstGeom>
+                    <a:noFill/>
+                    <a:ln>
+                      <a:noFill/>
+                    </a:ln>
+                  </pic:spPr>
+                </pic:pic>
+              </a:graphicData>
+            </a:graphic>
+          </wp:inline>
+        </w:drawing>
+      </w:r>
+    </w:p>
+    <w:p>
+      <w:pPr>
+        <w:rPr>
+          <w:b/>
+          <w:bCs/>
+        </w:rPr>
+      </w:pPr>
+      <w:r>
+        <w:rPr>
+          <w:b/>
+          <w:bCs/>
+          <w:noProof/>
+        </w:rPr>
+        <w:drawing>
+          <wp:inline distT="0" distB="0" distL="0" distR="0" wp14:anchorId="6AB10999" wp14:editId="4EE3EA14">
+            <wp:extent cx="3040380" cy="1882140"/>
+            <wp:effectExtent l="0" t="0" r="7620" b="3810"/>
+            <wp:docPr id="1814732694" name="Image 4"/>
+            <wp:cNvGraphicFramePr>
+              <a:graphicFrameLocks xmlns:a="http://schemas.openxmlformats.org/drawingml/2006/main" noChangeAspect="1"/>
+            </wp:cNvGraphicFramePr>
+            <a:graphic xmlns:a="http://schemas.openxmlformats.org/drawingml/2006/main">
+              <a:graphicData uri="http://schemas.openxmlformats.org/drawingml/2006/picture">
+                <pic:pic xmlns:pic="http://schemas.openxmlformats.org/drawingml/2006/picture">
+                  <pic:nvPicPr>
+                    <pic:cNvPr id="0" name="Picture 18"/>
+                    <pic:cNvPicPr>
+                      <a:picLocks noChangeAspect="1" noChangeArrowheads="1"/>
+                    </pic:cNvPicPr>
+                  </pic:nvPicPr>
+                  <pic:blipFill>
+                    <a:blip r:embed="rId17">
+                      <a:extLst>
+                        <a:ext uri="{28A0092B-C50C-407E-A947-70E740481C1C}">
+                          <a14:useLocalDpi xmlns:a14="http://schemas.microsoft.com/office/drawing/2010/main" val="0"/>
+                        </a:ext>
+                      </a:extLst>
+                    </a:blip>
+                    <a:srcRect/>
+                    <a:stretch>
+                      <a:fillRect/>
+                    </a:stretch>
+                  </pic:blipFill>
+                  <pic:spPr bwMode="auto">
+                    <a:xfrm>
+                      <a:off x="0" y="0"/>
+                      <a:ext cx="3040380" cy="1882140"/>
+                    </a:xfrm>
+                    <a:prstGeom prst="rect">
+                      <a:avLst/>
+                    </a:prstGeom>
+                    <a:noFill/>
+                    <a:ln>
+                      <a:noFill/>
+                    </a:ln>
+                  </pic:spPr>
+                </pic:pic>
+              </a:graphicData>
+            </a:graphic>
+          </wp:inline>
+        </w:drawing>
+      </w:r>
+    </w:p>
+    <w:p>
+      <w:pPr>
+        <w:jc w:val="center"/>
+        <w:rPr>
+          <w:b/>
+          <w:bCs/>
+        </w:rPr>
+      </w:pPr>
+    </w:p>
+    <w:p>
+      <w:pPr>
+        <w:jc w:val="center"/>
+        <w:rPr>
+          <w:b/>
+          <w:bCs/>
+        </w:rPr>
+      </w:pPr>
+      <w:r>
+        <w:rPr>
+          <w:b/>
+          <w:bCs/>
+        </w:rPr>
+        <w:t>Dashboard Direction (pilotage global)</w:t>
+      </w:r>
+    </w:p>
+    <w:p>
+      <w:pPr>
+        <w:jc w:val="both"/>
+      </w:pPr>
+      <w:r>
+        <w:t>Mettre :</w:t>
+      </w:r>
+    </w:p>
+    <w:p>
+      <w:pPr>
+        <w:numPr>
+          <w:ilvl w:val="0"/>
+          <w:numId w:val="25"/>
+        </w:numPr>
+        <w:jc w:val="both"/>
+      </w:pPr>
+      <w:r>
+        <w:t>Évolution du chiffre d’affaires des biens achetés par année</w:t>
+      </w:r>
+    </w:p>
+    <w:p>
+      <w:pPr>
+        <w:numPr>
+          <w:ilvl w:val="0"/>
+          <w:numId w:val="25"/>
+        </w:numPr>
+        <w:jc w:val="both"/>
+      </w:pPr>
+      <w:r>
+        <w:lastRenderedPageBreak/>
+        <w:t>Durée moyenne (en jours) entre la date de visite et la date de location ou d’achat</w:t>
+      </w:r>
+    </w:p>
+    <w:p>
+      <w:pPr>
+        <w:numPr>
+          <w:ilvl w:val="0"/>
+          <w:numId w:val="25"/>
+        </w:numPr>
+        <w:jc w:val="both"/>
+      </w:pPr>
+      <w:r>
+        <w:t>Nombre de biens achetés ou loués par département et par région (avec alerteur &gt; 5)</w:t>
+      </w:r>
+    </w:p>
+    <w:p>
+      <w:pPr>
+        <w:numPr>
+          <w:ilvl w:val="0"/>
+          <w:numId w:val="25"/>
+        </w:numPr>
+        <w:jc w:val="both"/>
+      </w:pPr>
+      <w:r>
+        <w:t>Nombre de biens vendus</w:t>
+      </w:r>
+    </w:p>
+    <w:p>
+      <w:pPr>
+        <w:numPr>
+          <w:ilvl w:val="0"/>
+          <w:numId w:val="25"/>
+        </w:numPr>
+        <w:jc w:val="both"/>
+      </w:pPr>
+      <w:r>
+        <w:t>Nombre de biens loués</w:t>
+      </w:r>
+    </w:p>
+    <w:p>
+      <w:pPr>
+        <w:numPr>
+          <w:ilvl w:val="0"/>
+          <w:numId w:val="25"/>
+        </w:numPr>
+        <w:jc w:val="both"/>
+      </w:pPr>
+      <w:r>
+        <w:t>Prix moyen des biens loués</w:t>
+      </w:r>
+    </w:p>
+    <w:p>
+      <w:pPr>
+        <w:numPr>
+          <w:ilvl w:val="0"/>
+          <w:numId w:val="25"/>
+        </w:numPr>
+        <w:jc w:val="both"/>
+      </w:pPr>
+      <w:r>
+        <w:t>Prix moyen de vente au mètre carré</w:t>
+      </w:r>
+    </w:p>
+    <w:p>
+      <w:pPr>
+        <w:jc w:val="both"/>
+      </w:pPr>
+      <w:r>
+        <w:t xml:space="preserve">Ce </w:t>
+      </w:r>
+      <w:proofErr w:type="spellStart"/>
+      <w:r>
+        <w:t>dashboard</w:t>
+      </w:r>
+      <w:proofErr w:type="spellEnd"/>
+      <w:r>
+        <w:t xml:space="preserve"> sert à </w:t>
+      </w:r>
+      <w:r>
+        <w:rPr>
+          <w:b/>
+          <w:bCs/>
+        </w:rPr>
+        <w:t>voir la performance globale de l’agence</w:t>
+      </w:r>
+      <w:r>
+        <w:t>.</w:t>
+      </w:r>
+    </w:p>
+    <w:p>
+      <w:pPr>
+        <w:jc w:val="center"/>
+        <w:rPr>
+          <w:b/>
+          <w:bCs/>
+        </w:rPr>
+      </w:pPr>
+      <w:r>
+        <w:rPr>
+          <w:b/>
+          <w:bCs/>
+        </w:rPr>
+        <w:t>Dashboard Commercial / Agents (performance par agent)</w:t>
+      </w:r>
+    </w:p>
+    <w:p>
+      <w:pPr>
+        <w:jc w:val="both"/>
+      </w:pPr>
+      <w:r>
+        <w:t>Mettre :</w:t>
+      </w:r>
+    </w:p>
+    <w:p>
+      <w:pPr>
+        <w:numPr>
+          <w:ilvl w:val="0"/>
+          <w:numId w:val="26"/>
+        </w:numPr>
+        <w:jc w:val="both"/>
+      </w:pPr>
+      <w:r>
+        <w:t>Chiffre d’affaires des biens vendus par agent avec mise en évidence du Top 3</w:t>
+      </w:r>
+    </w:p>
+    <w:p>
+      <w:pPr>
+        <w:numPr>
+          <w:ilvl w:val="0"/>
+          <w:numId w:val="26"/>
+        </w:numPr>
+        <w:jc w:val="both"/>
+      </w:pPr>
+      <w:r>
+        <w:t>Écart moyen entre le prix de vente du bien et le prix d’achat négocié par le client</w:t>
+      </w:r>
+    </w:p>
+    <w:p>
+      <w:pPr>
+        <w:jc w:val="both"/>
+      </w:pPr>
+      <w:r>
+        <w:t xml:space="preserve">Ce </w:t>
+      </w:r>
+      <w:proofErr w:type="spellStart"/>
+      <w:r>
+        <w:t>dashboard</w:t>
+      </w:r>
+      <w:proofErr w:type="spellEnd"/>
+      <w:r>
+        <w:t xml:space="preserve"> sert à </w:t>
+      </w:r>
+      <w:r>
+        <w:rPr>
+          <w:b/>
+          <w:bCs/>
+        </w:rPr>
+        <w:t>analyser la performance commerciale et la négociation des agents</w:t>
+      </w:r>
+      <w:r>
+        <w:t>.</w:t>
+      </w:r>
+    </w:p>
+    <w:p>
+      <w:pPr>
+        <w:jc w:val="center"/>
+        <w:rPr>
+          <w:b/>
+          <w:bCs/>
+        </w:rPr>
+      </w:pPr>
+      <w:r>
+        <w:rPr>
+          <w:b/>
+          <w:bCs/>
+        </w:rPr>
+        <w:t>Dashboard Patrimoine / Stock (biens et portefeuille)</w:t>
+      </w:r>
+    </w:p>
+    <w:p>
+      <w:pPr>
+        <w:jc w:val="both"/>
+      </w:pPr>
+      <w:r>
+        <w:t>Mettre :</w:t>
+      </w:r>
+    </w:p>
+    <w:p>
+      <w:pPr>
+        <w:numPr>
+          <w:ilvl w:val="0"/>
+          <w:numId w:val="27"/>
+        </w:numPr>
+        <w:jc w:val="both"/>
+      </w:pPr>
+      <w:r>
+        <w:t>Nombre de clients locataires par tranche d’âge (20–30, 31–50, &gt;50)</w:t>
+      </w:r>
+    </w:p>
+    <w:p>
+      <w:pPr>
+        <w:numPr>
+          <w:ilvl w:val="0"/>
+          <w:numId w:val="27"/>
+        </w:numPr>
+        <w:jc w:val="both"/>
+      </w:pPr>
+      <w:r>
+        <w:t>Répartition des clients homme / femme (en %)</w:t>
+      </w:r>
+    </w:p>
+    <w:p>
+      <w:pPr>
+        <w:numPr>
+          <w:ilvl w:val="0"/>
+          <w:numId w:val="27"/>
+        </w:numPr>
+        <w:jc w:val="both"/>
+      </w:pPr>
+      <w:r>
+        <w:t>Nombre de biens à rénover</w:t>
+      </w:r>
+    </w:p>
+    <w:p>
+      <w:pPr>
+        <w:numPr>
+          <w:ilvl w:val="0"/>
+          <w:numId w:val="27"/>
+        </w:numPr>
+        <w:jc w:val="both"/>
+      </w:pPr>
+      <w:r>
+        <w:t>Nombre de biens à la vente proposant la vente d’un lot supplémentaire de type garage</w:t>
+      </w:r>
+    </w:p>
+    <w:p>
+      <w:pPr>
+        <w:jc w:val="both"/>
+      </w:pPr>
+      <w:r>
+        <w:t xml:space="preserve">Ce </w:t>
+      </w:r>
+      <w:proofErr w:type="spellStart"/>
+      <w:r>
+        <w:t>dashboard</w:t>
+      </w:r>
+      <w:proofErr w:type="spellEnd"/>
+      <w:r>
+        <w:t xml:space="preserve"> sert à </w:t>
+      </w:r>
+      <w:r>
+        <w:rPr>
+          <w:b/>
+          <w:bCs/>
+        </w:rPr>
+        <w:t>analyser les biens et le profil des clients</w:t>
+      </w:r>
+      <w:r>
+        <w:t>.</w:t>
+      </w:r>
+    </w:p>
+    <w:p>
+      <w:pPr>
+        <w:jc w:val="both"/>
+      </w:pPr>
+    </w:p>
+    <w:p>
+      <w:pPr>
+        <w:jc w:val="both"/>
+      </w:pPr>
     </w:p>
     <w:sectPr>
       <w:pgSz w:w="11906" w:h="16838"/>
@@ -10505,6 +12677,304 @@
     </w:lvl>
   </w:abstractNum>
   <w:abstractNum w:abstractNumId="5" w15:restartNumberingAfterBreak="0">
+    <w:nsid w:val="10972952"/>
+    <w:multiLevelType w:val="multilevel"/>
+    <w:tmpl w:val="EFF2B9C2"/>
+    <w:lvl w:ilvl="0">
+      <w:start w:val="1"/>
+      <w:numFmt w:val="bullet"/>
+      <w:lvlText w:val=""/>
+      <w:lvlJc w:val="left"/>
+      <w:pPr>
+        <w:tabs>
+          <w:tab w:val="num" w:pos="720"/>
+        </w:tabs>
+        <w:ind w:left="720" w:hanging="360"/>
+      </w:pPr>
+      <w:rPr>
+        <w:rFonts w:ascii="Symbol" w:hAnsi="Symbol" w:hint="default"/>
+        <w:sz w:val="20"/>
+      </w:rPr>
+    </w:lvl>
+    <w:lvl w:ilvl="1" w:tentative="1">
+      <w:start w:val="1"/>
+      <w:numFmt w:val="bullet"/>
+      <w:lvlText w:val="o"/>
+      <w:lvlJc w:val="left"/>
+      <w:pPr>
+        <w:tabs>
+          <w:tab w:val="num" w:pos="1440"/>
+        </w:tabs>
+        <w:ind w:left="1440" w:hanging="360"/>
+      </w:pPr>
+      <w:rPr>
+        <w:rFonts w:ascii="Courier New" w:hAnsi="Courier New" w:hint="default"/>
+        <w:sz w:val="20"/>
+      </w:rPr>
+    </w:lvl>
+    <w:lvl w:ilvl="2" w:tentative="1">
+      <w:start w:val="1"/>
+      <w:numFmt w:val="bullet"/>
+      <w:lvlText w:val=""/>
+      <w:lvlJc w:val="left"/>
+      <w:pPr>
+        <w:tabs>
+          <w:tab w:val="num" w:pos="2160"/>
+        </w:tabs>
+        <w:ind w:left="2160" w:hanging="360"/>
+      </w:pPr>
+      <w:rPr>
+        <w:rFonts w:ascii="Wingdings" w:hAnsi="Wingdings" w:hint="default"/>
+        <w:sz w:val="20"/>
+      </w:rPr>
+    </w:lvl>
+    <w:lvl w:ilvl="3" w:tentative="1">
+      <w:start w:val="1"/>
+      <w:numFmt w:val="bullet"/>
+      <w:lvlText w:val=""/>
+      <w:lvlJc w:val="left"/>
+      <w:pPr>
+        <w:tabs>
+          <w:tab w:val="num" w:pos="2880"/>
+        </w:tabs>
+        <w:ind w:left="2880" w:hanging="360"/>
+      </w:pPr>
+      <w:rPr>
+        <w:rFonts w:ascii="Wingdings" w:hAnsi="Wingdings" w:hint="default"/>
+        <w:sz w:val="20"/>
+      </w:rPr>
+    </w:lvl>
+    <w:lvl w:ilvl="4" w:tentative="1">
+      <w:start w:val="1"/>
+      <w:numFmt w:val="bullet"/>
+      <w:lvlText w:val=""/>
+      <w:lvlJc w:val="left"/>
+      <w:pPr>
+        <w:tabs>
+          <w:tab w:val="num" w:pos="3600"/>
+        </w:tabs>
+        <w:ind w:left="3600" w:hanging="360"/>
+      </w:pPr>
+      <w:rPr>
+        <w:rFonts w:ascii="Wingdings" w:hAnsi="Wingdings" w:hint="default"/>
+        <w:sz w:val="20"/>
+      </w:rPr>
+    </w:lvl>
+    <w:lvl w:ilvl="5" w:tentative="1">
+      <w:start w:val="1"/>
+      <w:numFmt w:val="bullet"/>
+      <w:lvlText w:val=""/>
+      <w:lvlJc w:val="left"/>
+      <w:pPr>
+        <w:tabs>
+          <w:tab w:val="num" w:pos="4320"/>
+        </w:tabs>
+        <w:ind w:left="4320" w:hanging="360"/>
+      </w:pPr>
+      <w:rPr>
+        <w:rFonts w:ascii="Wingdings" w:hAnsi="Wingdings" w:hint="default"/>
+        <w:sz w:val="20"/>
+      </w:rPr>
+    </w:lvl>
+    <w:lvl w:ilvl="6" w:tentative="1">
+      <w:start w:val="1"/>
+      <w:numFmt w:val="bullet"/>
+      <w:lvlText w:val=""/>
+      <w:lvlJc w:val="left"/>
+      <w:pPr>
+        <w:tabs>
+          <w:tab w:val="num" w:pos="5040"/>
+        </w:tabs>
+        <w:ind w:left="5040" w:hanging="360"/>
+      </w:pPr>
+      <w:rPr>
+        <w:rFonts w:ascii="Wingdings" w:hAnsi="Wingdings" w:hint="default"/>
+        <w:sz w:val="20"/>
+      </w:rPr>
+    </w:lvl>
+    <w:lvl w:ilvl="7" w:tentative="1">
+      <w:start w:val="1"/>
+      <w:numFmt w:val="bullet"/>
+      <w:lvlText w:val=""/>
+      <w:lvlJc w:val="left"/>
+      <w:pPr>
+        <w:tabs>
+          <w:tab w:val="num" w:pos="5760"/>
+        </w:tabs>
+        <w:ind w:left="5760" w:hanging="360"/>
+      </w:pPr>
+      <w:rPr>
+        <w:rFonts w:ascii="Wingdings" w:hAnsi="Wingdings" w:hint="default"/>
+        <w:sz w:val="20"/>
+      </w:rPr>
+    </w:lvl>
+    <w:lvl w:ilvl="8" w:tentative="1">
+      <w:start w:val="1"/>
+      <w:numFmt w:val="bullet"/>
+      <w:lvlText w:val=""/>
+      <w:lvlJc w:val="left"/>
+      <w:pPr>
+        <w:tabs>
+          <w:tab w:val="num" w:pos="6480"/>
+        </w:tabs>
+        <w:ind w:left="6480" w:hanging="360"/>
+      </w:pPr>
+      <w:rPr>
+        <w:rFonts w:ascii="Wingdings" w:hAnsi="Wingdings" w:hint="default"/>
+        <w:sz w:val="20"/>
+      </w:rPr>
+    </w:lvl>
+  </w:abstractNum>
+  <w:abstractNum w:abstractNumId="6" w15:restartNumberingAfterBreak="0">
+    <w:nsid w:val="13DD363C"/>
+    <w:multiLevelType w:val="multilevel"/>
+    <w:tmpl w:val="BB5E9638"/>
+    <w:lvl w:ilvl="0">
+      <w:start w:val="1"/>
+      <w:numFmt w:val="bullet"/>
+      <w:lvlText w:val=""/>
+      <w:lvlJc w:val="left"/>
+      <w:pPr>
+        <w:tabs>
+          <w:tab w:val="num" w:pos="720"/>
+        </w:tabs>
+        <w:ind w:left="720" w:hanging="360"/>
+      </w:pPr>
+      <w:rPr>
+        <w:rFonts w:ascii="Symbol" w:hAnsi="Symbol" w:hint="default"/>
+        <w:sz w:val="20"/>
+      </w:rPr>
+    </w:lvl>
+    <w:lvl w:ilvl="1" w:tentative="1">
+      <w:start w:val="1"/>
+      <w:numFmt w:val="bullet"/>
+      <w:lvlText w:val="o"/>
+      <w:lvlJc w:val="left"/>
+      <w:pPr>
+        <w:tabs>
+          <w:tab w:val="num" w:pos="1440"/>
+        </w:tabs>
+        <w:ind w:left="1440" w:hanging="360"/>
+      </w:pPr>
+      <w:rPr>
+        <w:rFonts w:ascii="Courier New" w:hAnsi="Courier New" w:hint="default"/>
+        <w:sz w:val="20"/>
+      </w:rPr>
+    </w:lvl>
+    <w:lvl w:ilvl="2" w:tentative="1">
+      <w:start w:val="1"/>
+      <w:numFmt w:val="bullet"/>
+      <w:lvlText w:val=""/>
+      <w:lvlJc w:val="left"/>
+      <w:pPr>
+        <w:tabs>
+          <w:tab w:val="num" w:pos="2160"/>
+        </w:tabs>
+        <w:ind w:left="2160" w:hanging="360"/>
+      </w:pPr>
+      <w:rPr>
+        <w:rFonts w:ascii="Wingdings" w:hAnsi="Wingdings" w:hint="default"/>
+        <w:sz w:val="20"/>
+      </w:rPr>
+    </w:lvl>
+    <w:lvl w:ilvl="3" w:tentative="1">
+      <w:start w:val="1"/>
+      <w:numFmt w:val="bullet"/>
+      <w:lvlText w:val=""/>
+      <w:lvlJc w:val="left"/>
+      <w:pPr>
+        <w:tabs>
+          <w:tab w:val="num" w:pos="2880"/>
+        </w:tabs>
+        <w:ind w:left="2880" w:hanging="360"/>
+      </w:pPr>
+      <w:rPr>
+        <w:rFonts w:ascii="Wingdings" w:hAnsi="Wingdings" w:hint="default"/>
+        <w:sz w:val="20"/>
+      </w:rPr>
+    </w:lvl>
+    <w:lvl w:ilvl="4" w:tentative="1">
+      <w:start w:val="1"/>
+      <w:numFmt w:val="bullet"/>
+      <w:lvlText w:val=""/>
+      <w:lvlJc w:val="left"/>
+      <w:pPr>
+        <w:tabs>
+          <w:tab w:val="num" w:pos="3600"/>
+        </w:tabs>
+        <w:ind w:left="3600" w:hanging="360"/>
+      </w:pPr>
+      <w:rPr>
+        <w:rFonts w:ascii="Wingdings" w:hAnsi="Wingdings" w:hint="default"/>
+        <w:sz w:val="20"/>
+      </w:rPr>
+    </w:lvl>
+    <w:lvl w:ilvl="5" w:tentative="1">
+      <w:start w:val="1"/>
+      <w:numFmt w:val="bullet"/>
+      <w:lvlText w:val=""/>
+      <w:lvlJc w:val="left"/>
+      <w:pPr>
+        <w:tabs>
+          <w:tab w:val="num" w:pos="4320"/>
+        </w:tabs>
+        <w:ind w:left="4320" w:hanging="360"/>
+      </w:pPr>
+      <w:rPr>
+        <w:rFonts w:ascii="Wingdings" w:hAnsi="Wingdings" w:hint="default"/>
+        <w:sz w:val="20"/>
+      </w:rPr>
+    </w:lvl>
+    <w:lvl w:ilvl="6" w:tentative="1">
+      <w:start w:val="1"/>
+      <w:numFmt w:val="bullet"/>
+      <w:lvlText w:val=""/>
+      <w:lvlJc w:val="left"/>
+      <w:pPr>
+        <w:tabs>
+          <w:tab w:val="num" w:pos="5040"/>
+        </w:tabs>
+        <w:ind w:left="5040" w:hanging="360"/>
+      </w:pPr>
+      <w:rPr>
+        <w:rFonts w:ascii="Wingdings" w:hAnsi="Wingdings" w:hint="default"/>
+        <w:sz w:val="20"/>
+      </w:rPr>
+    </w:lvl>
+    <w:lvl w:ilvl="7" w:tentative="1">
+      <w:start w:val="1"/>
+      <w:numFmt w:val="bullet"/>
+      <w:lvlText w:val=""/>
+      <w:lvlJc w:val="left"/>
+      <w:pPr>
+        <w:tabs>
+          <w:tab w:val="num" w:pos="5760"/>
+        </w:tabs>
+        <w:ind w:left="5760" w:hanging="360"/>
+      </w:pPr>
+      <w:rPr>
+        <w:rFonts w:ascii="Wingdings" w:hAnsi="Wingdings" w:hint="default"/>
+        <w:sz w:val="20"/>
+      </w:rPr>
+    </w:lvl>
+    <w:lvl w:ilvl="8" w:tentative="1">
+      <w:start w:val="1"/>
+      <w:numFmt w:val="bullet"/>
+      <w:lvlText w:val=""/>
+      <w:lvlJc w:val="left"/>
+      <w:pPr>
+        <w:tabs>
+          <w:tab w:val="num" w:pos="6480"/>
+        </w:tabs>
+        <w:ind w:left="6480" w:hanging="360"/>
+      </w:pPr>
+      <w:rPr>
+        <w:rFonts w:ascii="Wingdings" w:hAnsi="Wingdings" w:hint="default"/>
+        <w:sz w:val="20"/>
+      </w:rPr>
+    </w:lvl>
+  </w:abstractNum>
+  <w:abstractNum w:abstractNumId="7" w15:restartNumberingAfterBreak="0">
     <w:nsid w:val="149A1B86"/>
     <w:multiLevelType w:val="multilevel"/>
     <w:tmpl w:val="4E14B93A"/>
@@ -10653,7 +13123,7 @@
       </w:rPr>
     </w:lvl>
   </w:abstractNum>
-  <w:abstractNum w:abstractNumId="6" w15:restartNumberingAfterBreak="0">
+  <w:abstractNum w:abstractNumId="8" w15:restartNumberingAfterBreak="0">
     <w:nsid w:val="15830319"/>
     <w:multiLevelType w:val="multilevel"/>
     <w:tmpl w:val="09BE0012"/>
@@ -10802,7 +13272,7 @@
       </w:rPr>
     </w:lvl>
   </w:abstractNum>
-  <w:abstractNum w:abstractNumId="7" w15:restartNumberingAfterBreak="0">
+  <w:abstractNum w:abstractNumId="9" w15:restartNumberingAfterBreak="0">
     <w:nsid w:val="16533046"/>
     <w:multiLevelType w:val="multilevel"/>
     <w:tmpl w:val="4D0C504E"/>
@@ -10951,7 +13421,7 @@
       </w:rPr>
     </w:lvl>
   </w:abstractNum>
-  <w:abstractNum w:abstractNumId="8" w15:restartNumberingAfterBreak="0">
+  <w:abstractNum w:abstractNumId="10" w15:restartNumberingAfterBreak="0">
     <w:nsid w:val="1F134D2E"/>
     <w:multiLevelType w:val="multilevel"/>
     <w:tmpl w:val="6C42A7A8"/>
@@ -11100,7 +13570,305 @@
       </w:rPr>
     </w:lvl>
   </w:abstractNum>
-  <w:abstractNum w:abstractNumId="9" w15:restartNumberingAfterBreak="0">
+  <w:abstractNum w:abstractNumId="11" w15:restartNumberingAfterBreak="0">
+    <w:nsid w:val="247F548D"/>
+    <w:multiLevelType w:val="multilevel"/>
+    <w:tmpl w:val="D4369898"/>
+    <w:lvl w:ilvl="0">
+      <w:start w:val="1"/>
+      <w:numFmt w:val="bullet"/>
+      <w:lvlText w:val=""/>
+      <w:lvlJc w:val="left"/>
+      <w:pPr>
+        <w:tabs>
+          <w:tab w:val="num" w:pos="720"/>
+        </w:tabs>
+        <w:ind w:left="720" w:hanging="360"/>
+      </w:pPr>
+      <w:rPr>
+        <w:rFonts w:ascii="Symbol" w:hAnsi="Symbol" w:hint="default"/>
+        <w:sz w:val="20"/>
+      </w:rPr>
+    </w:lvl>
+    <w:lvl w:ilvl="1" w:tentative="1">
+      <w:start w:val="1"/>
+      <w:numFmt w:val="bullet"/>
+      <w:lvlText w:val="o"/>
+      <w:lvlJc w:val="left"/>
+      <w:pPr>
+        <w:tabs>
+          <w:tab w:val="num" w:pos="1440"/>
+        </w:tabs>
+        <w:ind w:left="1440" w:hanging="360"/>
+      </w:pPr>
+      <w:rPr>
+        <w:rFonts w:ascii="Courier New" w:hAnsi="Courier New" w:hint="default"/>
+        <w:sz w:val="20"/>
+      </w:rPr>
+    </w:lvl>
+    <w:lvl w:ilvl="2" w:tentative="1">
+      <w:start w:val="1"/>
+      <w:numFmt w:val="bullet"/>
+      <w:lvlText w:val=""/>
+      <w:lvlJc w:val="left"/>
+      <w:pPr>
+        <w:tabs>
+          <w:tab w:val="num" w:pos="2160"/>
+        </w:tabs>
+        <w:ind w:left="2160" w:hanging="360"/>
+      </w:pPr>
+      <w:rPr>
+        <w:rFonts w:ascii="Wingdings" w:hAnsi="Wingdings" w:hint="default"/>
+        <w:sz w:val="20"/>
+      </w:rPr>
+    </w:lvl>
+    <w:lvl w:ilvl="3" w:tentative="1">
+      <w:start w:val="1"/>
+      <w:numFmt w:val="bullet"/>
+      <w:lvlText w:val=""/>
+      <w:lvlJc w:val="left"/>
+      <w:pPr>
+        <w:tabs>
+          <w:tab w:val="num" w:pos="2880"/>
+        </w:tabs>
+        <w:ind w:left="2880" w:hanging="360"/>
+      </w:pPr>
+      <w:rPr>
+        <w:rFonts w:ascii="Wingdings" w:hAnsi="Wingdings" w:hint="default"/>
+        <w:sz w:val="20"/>
+      </w:rPr>
+    </w:lvl>
+    <w:lvl w:ilvl="4" w:tentative="1">
+      <w:start w:val="1"/>
+      <w:numFmt w:val="bullet"/>
+      <w:lvlText w:val=""/>
+      <w:lvlJc w:val="left"/>
+      <w:pPr>
+        <w:tabs>
+          <w:tab w:val="num" w:pos="3600"/>
+        </w:tabs>
+        <w:ind w:left="3600" w:hanging="360"/>
+      </w:pPr>
+      <w:rPr>
+        <w:rFonts w:ascii="Wingdings" w:hAnsi="Wingdings" w:hint="default"/>
+        <w:sz w:val="20"/>
+      </w:rPr>
+    </w:lvl>
+    <w:lvl w:ilvl="5" w:tentative="1">
+      <w:start w:val="1"/>
+      <w:numFmt w:val="bullet"/>
+      <w:lvlText w:val=""/>
+      <w:lvlJc w:val="left"/>
+      <w:pPr>
+        <w:tabs>
+          <w:tab w:val="num" w:pos="4320"/>
+        </w:tabs>
+        <w:ind w:left="4320" w:hanging="360"/>
+      </w:pPr>
+      <w:rPr>
+        <w:rFonts w:ascii="Wingdings" w:hAnsi="Wingdings" w:hint="default"/>
+        <w:sz w:val="20"/>
+      </w:rPr>
+    </w:lvl>
+    <w:lvl w:ilvl="6" w:tentative="1">
+      <w:start w:val="1"/>
+      <w:numFmt w:val="bullet"/>
+      <w:lvlText w:val=""/>
+      <w:lvlJc w:val="left"/>
+      <w:pPr>
+        <w:tabs>
+          <w:tab w:val="num" w:pos="5040"/>
+        </w:tabs>
+        <w:ind w:left="5040" w:hanging="360"/>
+      </w:pPr>
+      <w:rPr>
+        <w:rFonts w:ascii="Wingdings" w:hAnsi="Wingdings" w:hint="default"/>
+        <w:sz w:val="20"/>
+      </w:rPr>
+    </w:lvl>
+    <w:lvl w:ilvl="7" w:tentative="1">
+      <w:start w:val="1"/>
+      <w:numFmt w:val="bullet"/>
+      <w:lvlText w:val=""/>
+      <w:lvlJc w:val="left"/>
+      <w:pPr>
+        <w:tabs>
+          <w:tab w:val="num" w:pos="5760"/>
+        </w:tabs>
+        <w:ind w:left="5760" w:hanging="360"/>
+      </w:pPr>
+      <w:rPr>
+        <w:rFonts w:ascii="Wingdings" w:hAnsi="Wingdings" w:hint="default"/>
+        <w:sz w:val="20"/>
+      </w:rPr>
+    </w:lvl>
+    <w:lvl w:ilvl="8" w:tentative="1">
+      <w:start w:val="1"/>
+      <w:numFmt w:val="bullet"/>
+      <w:lvlText w:val=""/>
+      <w:lvlJc w:val="left"/>
+      <w:pPr>
+        <w:tabs>
+          <w:tab w:val="num" w:pos="6480"/>
+        </w:tabs>
+        <w:ind w:left="6480" w:hanging="360"/>
+      </w:pPr>
+      <w:rPr>
+        <w:rFonts w:ascii="Wingdings" w:hAnsi="Wingdings" w:hint="default"/>
+        <w:sz w:val="20"/>
+      </w:rPr>
+    </w:lvl>
+  </w:abstractNum>
+  <w:abstractNum w:abstractNumId="12" w15:restartNumberingAfterBreak="0">
+    <w:nsid w:val="2785527B"/>
+    <w:multiLevelType w:val="multilevel"/>
+    <w:tmpl w:val="DB26BA36"/>
+    <w:lvl w:ilvl="0">
+      <w:start w:val="1"/>
+      <w:numFmt w:val="bullet"/>
+      <w:lvlText w:val=""/>
+      <w:lvlJc w:val="left"/>
+      <w:pPr>
+        <w:tabs>
+          <w:tab w:val="num" w:pos="720"/>
+        </w:tabs>
+        <w:ind w:left="720" w:hanging="360"/>
+      </w:pPr>
+      <w:rPr>
+        <w:rFonts w:ascii="Symbol" w:hAnsi="Symbol" w:hint="default"/>
+        <w:sz w:val="20"/>
+      </w:rPr>
+    </w:lvl>
+    <w:lvl w:ilvl="1" w:tentative="1">
+      <w:start w:val="1"/>
+      <w:numFmt w:val="bullet"/>
+      <w:lvlText w:val="o"/>
+      <w:lvlJc w:val="left"/>
+      <w:pPr>
+        <w:tabs>
+          <w:tab w:val="num" w:pos="1440"/>
+        </w:tabs>
+        <w:ind w:left="1440" w:hanging="360"/>
+      </w:pPr>
+      <w:rPr>
+        <w:rFonts w:ascii="Courier New" w:hAnsi="Courier New" w:hint="default"/>
+        <w:sz w:val="20"/>
+      </w:rPr>
+    </w:lvl>
+    <w:lvl w:ilvl="2" w:tentative="1">
+      <w:start w:val="1"/>
+      <w:numFmt w:val="bullet"/>
+      <w:lvlText w:val=""/>
+      <w:lvlJc w:val="left"/>
+      <w:pPr>
+        <w:tabs>
+          <w:tab w:val="num" w:pos="2160"/>
+        </w:tabs>
+        <w:ind w:left="2160" w:hanging="360"/>
+      </w:pPr>
+      <w:rPr>
+        <w:rFonts w:ascii="Wingdings" w:hAnsi="Wingdings" w:hint="default"/>
+        <w:sz w:val="20"/>
+      </w:rPr>
+    </w:lvl>
+    <w:lvl w:ilvl="3" w:tentative="1">
+      <w:start w:val="1"/>
+      <w:numFmt w:val="bullet"/>
+      <w:lvlText w:val=""/>
+      <w:lvlJc w:val="left"/>
+      <w:pPr>
+        <w:tabs>
+          <w:tab w:val="num" w:pos="2880"/>
+        </w:tabs>
+        <w:ind w:left="2880" w:hanging="360"/>
+      </w:pPr>
+      <w:rPr>
+        <w:rFonts w:ascii="Wingdings" w:hAnsi="Wingdings" w:hint="default"/>
+        <w:sz w:val="20"/>
+      </w:rPr>
+    </w:lvl>
+    <w:lvl w:ilvl="4" w:tentative="1">
+      <w:start w:val="1"/>
+      <w:numFmt w:val="bullet"/>
+      <w:lvlText w:val=""/>
+      <w:lvlJc w:val="left"/>
+      <w:pPr>
+        <w:tabs>
+          <w:tab w:val="num" w:pos="3600"/>
+        </w:tabs>
+        <w:ind w:left="3600" w:hanging="360"/>
+      </w:pPr>
+      <w:rPr>
+        <w:rFonts w:ascii="Wingdings" w:hAnsi="Wingdings" w:hint="default"/>
+        <w:sz w:val="20"/>
+      </w:rPr>
+    </w:lvl>
+    <w:lvl w:ilvl="5" w:tentative="1">
+      <w:start w:val="1"/>
+      <w:numFmt w:val="bullet"/>
+      <w:lvlText w:val=""/>
+      <w:lvlJc w:val="left"/>
+      <w:pPr>
+        <w:tabs>
+          <w:tab w:val="num" w:pos="4320"/>
+        </w:tabs>
+        <w:ind w:left="4320" w:hanging="360"/>
+      </w:pPr>
+      <w:rPr>
+        <w:rFonts w:ascii="Wingdings" w:hAnsi="Wingdings" w:hint="default"/>
+        <w:sz w:val="20"/>
+      </w:rPr>
+    </w:lvl>
+    <w:lvl w:ilvl="6" w:tentative="1">
+      <w:start w:val="1"/>
+      <w:numFmt w:val="bullet"/>
+      <w:lvlText w:val=""/>
+      <w:lvlJc w:val="left"/>
+      <w:pPr>
+        <w:tabs>
+          <w:tab w:val="num" w:pos="5040"/>
+        </w:tabs>
+        <w:ind w:left="5040" w:hanging="360"/>
+      </w:pPr>
+      <w:rPr>
+        <w:rFonts w:ascii="Wingdings" w:hAnsi="Wingdings" w:hint="default"/>
+        <w:sz w:val="20"/>
+      </w:rPr>
+    </w:lvl>
+    <w:lvl w:ilvl="7" w:tentative="1">
+      <w:start w:val="1"/>
+      <w:numFmt w:val="bullet"/>
+      <w:lvlText w:val=""/>
+      <w:lvlJc w:val="left"/>
+      <w:pPr>
+        <w:tabs>
+          <w:tab w:val="num" w:pos="5760"/>
+        </w:tabs>
+        <w:ind w:left="5760" w:hanging="360"/>
+      </w:pPr>
+      <w:rPr>
+        <w:rFonts w:ascii="Wingdings" w:hAnsi="Wingdings" w:hint="default"/>
+        <w:sz w:val="20"/>
+      </w:rPr>
+    </w:lvl>
+    <w:lvl w:ilvl="8" w:tentative="1">
+      <w:start w:val="1"/>
+      <w:numFmt w:val="bullet"/>
+      <w:lvlText w:val=""/>
+      <w:lvlJc w:val="left"/>
+      <w:pPr>
+        <w:tabs>
+          <w:tab w:val="num" w:pos="6480"/>
+        </w:tabs>
+        <w:ind w:left="6480" w:hanging="360"/>
+      </w:pPr>
+      <w:rPr>
+        <w:rFonts w:ascii="Wingdings" w:hAnsi="Wingdings" w:hint="default"/>
+        <w:sz w:val="20"/>
+      </w:rPr>
+    </w:lvl>
+  </w:abstractNum>
+  <w:abstractNum w:abstractNumId="13" w15:restartNumberingAfterBreak="0">
     <w:nsid w:val="2B395D76"/>
     <w:multiLevelType w:val="multilevel"/>
     <w:tmpl w:val="80B65C0C"/>
@@ -11249,7 +14017,156 @@
       </w:rPr>
     </w:lvl>
   </w:abstractNum>
-  <w:abstractNum w:abstractNumId="10" w15:restartNumberingAfterBreak="0">
+  <w:abstractNum w:abstractNumId="14" w15:restartNumberingAfterBreak="0">
+    <w:nsid w:val="30126EE5"/>
+    <w:multiLevelType w:val="multilevel"/>
+    <w:tmpl w:val="17BABBA6"/>
+    <w:lvl w:ilvl="0">
+      <w:start w:val="1"/>
+      <w:numFmt w:val="bullet"/>
+      <w:lvlText w:val=""/>
+      <w:lvlJc w:val="left"/>
+      <w:pPr>
+        <w:tabs>
+          <w:tab w:val="num" w:pos="720"/>
+        </w:tabs>
+        <w:ind w:left="720" w:hanging="360"/>
+      </w:pPr>
+      <w:rPr>
+        <w:rFonts w:ascii="Symbol" w:hAnsi="Symbol" w:hint="default"/>
+        <w:sz w:val="20"/>
+      </w:rPr>
+    </w:lvl>
+    <w:lvl w:ilvl="1" w:tentative="1">
+      <w:start w:val="1"/>
+      <w:numFmt w:val="bullet"/>
+      <w:lvlText w:val="o"/>
+      <w:lvlJc w:val="left"/>
+      <w:pPr>
+        <w:tabs>
+          <w:tab w:val="num" w:pos="1440"/>
+        </w:tabs>
+        <w:ind w:left="1440" w:hanging="360"/>
+      </w:pPr>
+      <w:rPr>
+        <w:rFonts w:ascii="Courier New" w:hAnsi="Courier New" w:hint="default"/>
+        <w:sz w:val="20"/>
+      </w:rPr>
+    </w:lvl>
+    <w:lvl w:ilvl="2" w:tentative="1">
+      <w:start w:val="1"/>
+      <w:numFmt w:val="bullet"/>
+      <w:lvlText w:val=""/>
+      <w:lvlJc w:val="left"/>
+      <w:pPr>
+        <w:tabs>
+          <w:tab w:val="num" w:pos="2160"/>
+        </w:tabs>
+        <w:ind w:left="2160" w:hanging="360"/>
+      </w:pPr>
+      <w:rPr>
+        <w:rFonts w:ascii="Wingdings" w:hAnsi="Wingdings" w:hint="default"/>
+        <w:sz w:val="20"/>
+      </w:rPr>
+    </w:lvl>
+    <w:lvl w:ilvl="3" w:tentative="1">
+      <w:start w:val="1"/>
+      <w:numFmt w:val="bullet"/>
+      <w:lvlText w:val=""/>
+      <w:lvlJc w:val="left"/>
+      <w:pPr>
+        <w:tabs>
+          <w:tab w:val="num" w:pos="2880"/>
+        </w:tabs>
+        <w:ind w:left="2880" w:hanging="360"/>
+      </w:pPr>
+      <w:rPr>
+        <w:rFonts w:ascii="Wingdings" w:hAnsi="Wingdings" w:hint="default"/>
+        <w:sz w:val="20"/>
+      </w:rPr>
+    </w:lvl>
+    <w:lvl w:ilvl="4" w:tentative="1">
+      <w:start w:val="1"/>
+      <w:numFmt w:val="bullet"/>
+      <w:lvlText w:val=""/>
+      <w:lvlJc w:val="left"/>
+      <w:pPr>
+        <w:tabs>
+          <w:tab w:val="num" w:pos="3600"/>
+        </w:tabs>
+        <w:ind w:left="3600" w:hanging="360"/>
+      </w:pPr>
+      <w:rPr>
+        <w:rFonts w:ascii="Wingdings" w:hAnsi="Wingdings" w:hint="default"/>
+        <w:sz w:val="20"/>
+      </w:rPr>
+    </w:lvl>
+    <w:lvl w:ilvl="5" w:tentative="1">
+      <w:start w:val="1"/>
+      <w:numFmt w:val="bullet"/>
+      <w:lvlText w:val=""/>
+      <w:lvlJc w:val="left"/>
+      <w:pPr>
+        <w:tabs>
+          <w:tab w:val="num" w:pos="4320"/>
+        </w:tabs>
+        <w:ind w:left="4320" w:hanging="360"/>
+      </w:pPr>
+      <w:rPr>
+        <w:rFonts w:ascii="Wingdings" w:hAnsi="Wingdings" w:hint="default"/>
+        <w:sz w:val="20"/>
+      </w:rPr>
+    </w:lvl>
+    <w:lvl w:ilvl="6" w:tentative="1">
+      <w:start w:val="1"/>
+      <w:numFmt w:val="bullet"/>
+      <w:lvlText w:val=""/>
+      <w:lvlJc w:val="left"/>
+      <w:pPr>
+        <w:tabs>
+          <w:tab w:val="num" w:pos="5040"/>
+        </w:tabs>
+        <w:ind w:left="5040" w:hanging="360"/>
+      </w:pPr>
+      <w:rPr>
+        <w:rFonts w:ascii="Wingdings" w:hAnsi="Wingdings" w:hint="default"/>
+        <w:sz w:val="20"/>
+      </w:rPr>
+    </w:lvl>
+    <w:lvl w:ilvl="7" w:tentative="1">
+      <w:start w:val="1"/>
+      <w:numFmt w:val="bullet"/>
+      <w:lvlText w:val=""/>
+      <w:lvlJc w:val="left"/>
+      <w:pPr>
+        <w:tabs>
+          <w:tab w:val="num" w:pos="5760"/>
+        </w:tabs>
+        <w:ind w:left="5760" w:hanging="360"/>
+      </w:pPr>
+      <w:rPr>
+        <w:rFonts w:ascii="Wingdings" w:hAnsi="Wingdings" w:hint="default"/>
+        <w:sz w:val="20"/>
+      </w:rPr>
+    </w:lvl>
+    <w:lvl w:ilvl="8" w:tentative="1">
+      <w:start w:val="1"/>
+      <w:numFmt w:val="bullet"/>
+      <w:lvlText w:val=""/>
+      <w:lvlJc w:val="left"/>
+      <w:pPr>
+        <w:tabs>
+          <w:tab w:val="num" w:pos="6480"/>
+        </w:tabs>
+        <w:ind w:left="6480" w:hanging="360"/>
+      </w:pPr>
+      <w:rPr>
+        <w:rFonts w:ascii="Wingdings" w:hAnsi="Wingdings" w:hint="default"/>
+        <w:sz w:val="20"/>
+      </w:rPr>
+    </w:lvl>
+  </w:abstractNum>
+  <w:abstractNum w:abstractNumId="15" w15:restartNumberingAfterBreak="0">
     <w:nsid w:val="385712FA"/>
     <w:multiLevelType w:val="multilevel"/>
     <w:tmpl w:val="82F8007C"/>
@@ -11398,7 +14315,7 @@
       </w:rPr>
     </w:lvl>
   </w:abstractNum>
-  <w:abstractNum w:abstractNumId="11" w15:restartNumberingAfterBreak="0">
+  <w:abstractNum w:abstractNumId="16" w15:restartNumberingAfterBreak="0">
     <w:nsid w:val="3A5500C2"/>
     <w:multiLevelType w:val="multilevel"/>
     <w:tmpl w:val="95042796"/>
@@ -11547,7 +14464,7 @@
       </w:rPr>
     </w:lvl>
   </w:abstractNum>
-  <w:abstractNum w:abstractNumId="12" w15:restartNumberingAfterBreak="0">
+  <w:abstractNum w:abstractNumId="17" w15:restartNumberingAfterBreak="0">
     <w:nsid w:val="3EA73E37"/>
     <w:multiLevelType w:val="multilevel"/>
     <w:tmpl w:val="111CC444"/>
@@ -11696,7 +14613,7 @@
       </w:rPr>
     </w:lvl>
   </w:abstractNum>
-  <w:abstractNum w:abstractNumId="13" w15:restartNumberingAfterBreak="0">
+  <w:abstractNum w:abstractNumId="18" w15:restartNumberingAfterBreak="0">
     <w:nsid w:val="4B4D103F"/>
     <w:multiLevelType w:val="multilevel"/>
     <w:tmpl w:val="C4D47842"/>
@@ -11845,7 +14762,7 @@
       </w:rPr>
     </w:lvl>
   </w:abstractNum>
-  <w:abstractNum w:abstractNumId="14" w15:restartNumberingAfterBreak="0">
+  <w:abstractNum w:abstractNumId="19" w15:restartNumberingAfterBreak="0">
     <w:nsid w:val="56B512E3"/>
     <w:multiLevelType w:val="multilevel"/>
     <w:tmpl w:val="72C20364"/>
@@ -11994,7 +14911,7 @@
       </w:rPr>
     </w:lvl>
   </w:abstractNum>
-  <w:abstractNum w:abstractNumId="15" w15:restartNumberingAfterBreak="0">
+  <w:abstractNum w:abstractNumId="20" w15:restartNumberingAfterBreak="0">
     <w:nsid w:val="56FC4170"/>
     <w:multiLevelType w:val="multilevel"/>
     <w:tmpl w:val="62BAEE0E"/>
@@ -12143,7 +15060,7 @@
       </w:rPr>
     </w:lvl>
   </w:abstractNum>
-  <w:abstractNum w:abstractNumId="16" w15:restartNumberingAfterBreak="0">
+  <w:abstractNum w:abstractNumId="21" w15:restartNumberingAfterBreak="0">
     <w:nsid w:val="5A717A7D"/>
     <w:multiLevelType w:val="hybridMultilevel"/>
     <w:tmpl w:val="B4D4A7E6"/>
@@ -12232,7 +15149,7 @@
       </w:pPr>
     </w:lvl>
   </w:abstractNum>
-  <w:abstractNum w:abstractNumId="17" w15:restartNumberingAfterBreak="0">
+  <w:abstractNum w:abstractNumId="22" w15:restartNumberingAfterBreak="0">
     <w:nsid w:val="5AF10CFE"/>
     <w:multiLevelType w:val="multilevel"/>
     <w:tmpl w:val="50729C54"/>
@@ -12381,7 +15298,7 @@
       </w:rPr>
     </w:lvl>
   </w:abstractNum>
-  <w:abstractNum w:abstractNumId="18" w15:restartNumberingAfterBreak="0">
+  <w:abstractNum w:abstractNumId="23" w15:restartNumberingAfterBreak="0">
     <w:nsid w:val="5C200F1C"/>
     <w:multiLevelType w:val="multilevel"/>
     <w:tmpl w:val="C074BBEC"/>
@@ -12530,7 +15447,7 @@
       </w:rPr>
     </w:lvl>
   </w:abstractNum>
-  <w:abstractNum w:abstractNumId="19" w15:restartNumberingAfterBreak="0">
+  <w:abstractNum w:abstractNumId="24" w15:restartNumberingAfterBreak="0">
     <w:nsid w:val="5F905DFC"/>
     <w:multiLevelType w:val="hybridMultilevel"/>
     <w:tmpl w:val="1A8826DA"/>
@@ -12643,7 +15560,7 @@
       </w:rPr>
     </w:lvl>
   </w:abstractNum>
-  <w:abstractNum w:abstractNumId="20" w15:restartNumberingAfterBreak="0">
+  <w:abstractNum w:abstractNumId="25" w15:restartNumberingAfterBreak="0">
     <w:nsid w:val="62D96427"/>
     <w:multiLevelType w:val="multilevel"/>
     <w:tmpl w:val="D56641AC"/>
@@ -12792,7 +15709,7 @@
       </w:rPr>
     </w:lvl>
   </w:abstractNum>
-  <w:abstractNum w:abstractNumId="21" w15:restartNumberingAfterBreak="0">
+  <w:abstractNum w:abstractNumId="26" w15:restartNumberingAfterBreak="0">
     <w:nsid w:val="6A4B7FFD"/>
     <w:multiLevelType w:val="hybridMultilevel"/>
     <w:tmpl w:val="F38C0ACA"/>
@@ -12881,7 +15798,7 @@
       </w:pPr>
     </w:lvl>
   </w:abstractNum>
-  <w:abstractNum w:abstractNumId="22" w15:restartNumberingAfterBreak="0">
+  <w:abstractNum w:abstractNumId="27" w15:restartNumberingAfterBreak="0">
     <w:nsid w:val="7E611656"/>
     <w:multiLevelType w:val="multilevel"/>
     <w:tmpl w:val="346801EE"/>
@@ -13030,7 +15947,7 @@
       </w:rPr>
     </w:lvl>
   </w:abstractNum>
-  <w:abstractNum w:abstractNumId="23" w15:restartNumberingAfterBreak="0">
+  <w:abstractNum w:abstractNumId="28" w15:restartNumberingAfterBreak="0">
     <w:nsid w:val="7FC32308"/>
     <w:multiLevelType w:val="multilevel"/>
     <w:tmpl w:val="53DA5164"/>
@@ -13180,16 +16097,16 @@
     </w:lvl>
   </w:abstractNum>
   <w:num w:numId="1" w16cid:durableId="33119828">
+    <w:abstractNumId w:val="26"/>
+  </w:num>
+  <w:num w:numId="2" w16cid:durableId="1646353266">
+    <w:abstractNumId w:val="24"/>
+  </w:num>
+  <w:num w:numId="3" w16cid:durableId="2118519213">
     <w:abstractNumId w:val="21"/>
   </w:num>
-  <w:num w:numId="2" w16cid:durableId="1646353266">
-    <w:abstractNumId w:val="19"/>
-  </w:num>
-  <w:num w:numId="3" w16cid:durableId="2118519213">
-    <w:abstractNumId w:val="16"/>
-  </w:num>
   <w:num w:numId="4" w16cid:durableId="530651153">
-    <w:abstractNumId w:val="7"/>
+    <w:abstractNumId w:val="9"/>
   </w:num>
   <w:num w:numId="5" w16cid:durableId="1105347858">
     <w:abstractNumId w:val="2"/>
@@ -13201,34 +16118,34 @@
     <w:abstractNumId w:val="1"/>
   </w:num>
   <w:num w:numId="8" w16cid:durableId="1363939908">
-    <w:abstractNumId w:val="9"/>
+    <w:abstractNumId w:val="13"/>
   </w:num>
   <w:num w:numId="9" w16cid:durableId="1044721285">
-    <w:abstractNumId w:val="22"/>
+    <w:abstractNumId w:val="27"/>
   </w:num>
   <w:num w:numId="10" w16cid:durableId="794832921">
-    <w:abstractNumId w:val="14"/>
+    <w:abstractNumId w:val="19"/>
   </w:num>
   <w:num w:numId="11" w16cid:durableId="1686898920">
-    <w:abstractNumId w:val="18"/>
+    <w:abstractNumId w:val="23"/>
   </w:num>
   <w:num w:numId="12" w16cid:durableId="1982467159">
+    <w:abstractNumId w:val="25"/>
+  </w:num>
+  <w:num w:numId="13" w16cid:durableId="1754205024">
+    <w:abstractNumId w:val="15"/>
+  </w:num>
+  <w:num w:numId="14" w16cid:durableId="725959129">
     <w:abstractNumId w:val="20"/>
   </w:num>
-  <w:num w:numId="13" w16cid:durableId="1754205024">
-    <w:abstractNumId w:val="10"/>
-  </w:num>
-  <w:num w:numId="14" w16cid:durableId="725959129">
-    <w:abstractNumId w:val="15"/>
-  </w:num>
   <w:num w:numId="15" w16cid:durableId="2141653622">
-    <w:abstractNumId w:val="11"/>
+    <w:abstractNumId w:val="16"/>
   </w:num>
   <w:num w:numId="16" w16cid:durableId="2087218485">
-    <w:abstractNumId w:val="12"/>
+    <w:abstractNumId w:val="17"/>
   </w:num>
   <w:num w:numId="17" w16cid:durableId="135340819">
-    <w:abstractNumId w:val="6"/>
+    <w:abstractNumId w:val="8"/>
   </w:num>
   <w:num w:numId="18" w16cid:durableId="546376113">
     <w:abstractNumId w:val="0"/>
@@ -13237,18 +16154,33 @@
     <w:abstractNumId w:val="4"/>
   </w:num>
   <w:num w:numId="20" w16cid:durableId="1174759431">
-    <w:abstractNumId w:val="8"/>
+    <w:abstractNumId w:val="10"/>
   </w:num>
   <w:num w:numId="21" w16cid:durableId="1594050139">
-    <w:abstractNumId w:val="23"/>
+    <w:abstractNumId w:val="28"/>
   </w:num>
   <w:num w:numId="22" w16cid:durableId="1862668688">
-    <w:abstractNumId w:val="17"/>
+    <w:abstractNumId w:val="22"/>
   </w:num>
   <w:num w:numId="23" w16cid:durableId="1010765">
-    <w:abstractNumId w:val="13"/>
+    <w:abstractNumId w:val="18"/>
   </w:num>
   <w:num w:numId="24" w16cid:durableId="1304889613">
+    <w:abstractNumId w:val="7"/>
+  </w:num>
+  <w:num w:numId="25" w16cid:durableId="588587437">
+    <w:abstractNumId w:val="6"/>
+  </w:num>
+  <w:num w:numId="26" w16cid:durableId="1386564030">
+    <w:abstractNumId w:val="11"/>
+  </w:num>
+  <w:num w:numId="27" w16cid:durableId="573777358">
+    <w:abstractNumId w:val="14"/>
+  </w:num>
+  <w:num w:numId="28" w16cid:durableId="301811006">
+    <w:abstractNumId w:val="12"/>
+  </w:num>
+  <w:num w:numId="29" w16cid:durableId="1640261774">
     <w:abstractNumId w:val="5"/>
   </w:num>
 </w:numbering>
@@ -13857,7 +16789,6 @@
   <w:style w:type="character" w:default="1" w:styleId="Policepardfaut">
     <w:name w:val="Default Paragraph Font"/>
     <w:uiPriority w:val="1"/>
-    <w:semiHidden/>
     <w:unhideWhenUsed/>
   </w:style>
   <w:style w:type="table" w:default="1" w:styleId="TableauNormal">

</xml_diff>